<commit_message>
Add final project PDF and update Lab_05.docx
Add report_finalProject.pdf (final project report) and apply a binary update to Lab_05.docx. The DOCX change is binary so no textual diff is available; this commit introduces the new PDF and replaces the lab document with the updated version.
</commit_message>
<xml_diff>
--- a/Lab_05.docx
+++ b/Lab_05.docx
@@ -187,7 +187,14 @@
           <w:b/>
           <w:sz w:val="32"/>
         </w:rPr>
-        <w:t>, nobody else</w:t>
+        <w:t xml:space="preserve">, </w:t>
+      </w:r>
+      <w:r>
+        <w:rPr>
+          <w:b/>
+          <w:sz w:val="32"/>
+        </w:rPr>
+        <w:t>Will Jessel, Zemmat Hagos</w:t>
       </w:r>
     </w:p>
     <w:p>
@@ -1109,7 +1116,7 @@
           <w:r>
             <w:fldChar w:fldCharType="separate"/>
           </w:r>
-          <w:hyperlink w:anchor="_Toc225441069" w:history="1">
+          <w:hyperlink w:anchor="_Toc226056554" w:history="1">
             <w:r>
               <w:rPr>
                 <w:rStyle w:val="Hyperlink"/>
@@ -1136,7 +1143,7 @@
                 <w:noProof/>
                 <w:webHidden/>
               </w:rPr>
-              <w:instrText xml:space="preserve"> PAGEREF _Toc225441069 \h </w:instrText>
+              <w:instrText xml:space="preserve"> PAGEREF _Toc226056554 \h </w:instrText>
             </w:r>
             <w:r>
               <w:rPr>
@@ -1180,7 +1187,7 @@
               <w:sz w:val="24"/>
             </w:rPr>
           </w:pPr>
-          <w:hyperlink w:anchor="_Toc225441070" w:history="1">
+          <w:hyperlink w:anchor="_Toc226056555" w:history="1">
             <w:r>
               <w:rPr>
                 <w:rStyle w:val="Hyperlink"/>
@@ -1207,7 +1214,7 @@
                 <w:noProof/>
                 <w:webHidden/>
               </w:rPr>
-              <w:instrText xml:space="preserve"> PAGEREF _Toc225441070 \h </w:instrText>
+              <w:instrText xml:space="preserve"> PAGEREF _Toc226056555 \h </w:instrText>
             </w:r>
             <w:r>
               <w:rPr>
@@ -1228,6 +1235,219 @@
                 <w:webHidden/>
               </w:rPr>
               <w:t>3</w:t>
+            </w:r>
+            <w:r>
+              <w:rPr>
+                <w:noProof/>
+                <w:webHidden/>
+              </w:rPr>
+              <w:fldChar w:fldCharType="end"/>
+            </w:r>
+          </w:hyperlink>
+        </w:p>
+        <w:p>
+          <w:pPr>
+            <w:pStyle w:val="TOC3"/>
+            <w:tabs>
+              <w:tab w:val="right" w:leader="dot" w:pos="9350"/>
+            </w:tabs>
+            <w:rPr>
+              <w:rFonts w:asciiTheme="minorHAnsi" w:eastAsiaTheme="minorEastAsia" w:hAnsiTheme="minorHAnsi" w:cstheme="minorBidi"/>
+              <w:noProof/>
+              <w:color w:val="auto"/>
+              <w:sz w:val="24"/>
+            </w:rPr>
+          </w:pPr>
+          <w:hyperlink w:anchor="_Toc226056556" w:history="1">
+            <w:r>
+              <w:rPr>
+                <w:rStyle w:val="Hyperlink"/>
+                <w:noProof/>
+              </w:rPr>
+              <w:t>User Design</w:t>
+            </w:r>
+            <w:r>
+              <w:rPr>
+                <w:noProof/>
+                <w:webHidden/>
+              </w:rPr>
+              <w:tab/>
+            </w:r>
+            <w:r>
+              <w:rPr>
+                <w:noProof/>
+                <w:webHidden/>
+              </w:rPr>
+              <w:fldChar w:fldCharType="begin"/>
+            </w:r>
+            <w:r>
+              <w:rPr>
+                <w:noProof/>
+                <w:webHidden/>
+              </w:rPr>
+              <w:instrText xml:space="preserve"> PAGEREF _Toc226056556 \h </w:instrText>
+            </w:r>
+            <w:r>
+              <w:rPr>
+                <w:noProof/>
+                <w:webHidden/>
+              </w:rPr>
+            </w:r>
+            <w:r>
+              <w:rPr>
+                <w:noProof/>
+                <w:webHidden/>
+              </w:rPr>
+              <w:fldChar w:fldCharType="separate"/>
+            </w:r>
+            <w:r>
+              <w:rPr>
+                <w:noProof/>
+                <w:webHidden/>
+              </w:rPr>
+              <w:t>3</w:t>
+            </w:r>
+            <w:r>
+              <w:rPr>
+                <w:noProof/>
+                <w:webHidden/>
+              </w:rPr>
+              <w:fldChar w:fldCharType="end"/>
+            </w:r>
+          </w:hyperlink>
+        </w:p>
+        <w:p>
+          <w:pPr>
+            <w:pStyle w:val="TOC3"/>
+            <w:tabs>
+              <w:tab w:val="right" w:leader="dot" w:pos="9350"/>
+            </w:tabs>
+            <w:rPr>
+              <w:rFonts w:asciiTheme="minorHAnsi" w:eastAsiaTheme="minorEastAsia" w:hAnsiTheme="minorHAnsi" w:cstheme="minorBidi"/>
+              <w:noProof/>
+              <w:color w:val="auto"/>
+              <w:sz w:val="24"/>
+            </w:rPr>
+          </w:pPr>
+          <w:hyperlink w:anchor="_Toc226056557" w:history="1">
+            <w:r>
+              <w:rPr>
+                <w:rStyle w:val="Hyperlink"/>
+                <w:noProof/>
+              </w:rPr>
+              <w:t>System design</w:t>
+            </w:r>
+            <w:r>
+              <w:rPr>
+                <w:noProof/>
+                <w:webHidden/>
+              </w:rPr>
+              <w:tab/>
+            </w:r>
+            <w:r>
+              <w:rPr>
+                <w:noProof/>
+                <w:webHidden/>
+              </w:rPr>
+              <w:fldChar w:fldCharType="begin"/>
+            </w:r>
+            <w:r>
+              <w:rPr>
+                <w:noProof/>
+                <w:webHidden/>
+              </w:rPr>
+              <w:instrText xml:space="preserve"> PAGEREF _Toc226056557 \h </w:instrText>
+            </w:r>
+            <w:r>
+              <w:rPr>
+                <w:noProof/>
+                <w:webHidden/>
+              </w:rPr>
+            </w:r>
+            <w:r>
+              <w:rPr>
+                <w:noProof/>
+                <w:webHidden/>
+              </w:rPr>
+              <w:fldChar w:fldCharType="separate"/>
+            </w:r>
+            <w:r>
+              <w:rPr>
+                <w:noProof/>
+                <w:webHidden/>
+              </w:rPr>
+              <w:t>3</w:t>
+            </w:r>
+            <w:r>
+              <w:rPr>
+                <w:noProof/>
+                <w:webHidden/>
+              </w:rPr>
+              <w:fldChar w:fldCharType="end"/>
+            </w:r>
+          </w:hyperlink>
+        </w:p>
+        <w:p>
+          <w:pPr>
+            <w:pStyle w:val="TOC3"/>
+            <w:tabs>
+              <w:tab w:val="right" w:leader="dot" w:pos="9350"/>
+            </w:tabs>
+            <w:rPr>
+              <w:rFonts w:asciiTheme="minorHAnsi" w:eastAsiaTheme="minorEastAsia" w:hAnsiTheme="minorHAnsi" w:cstheme="minorBidi"/>
+              <w:noProof/>
+              <w:color w:val="auto"/>
+              <w:sz w:val="24"/>
+            </w:rPr>
+          </w:pPr>
+          <w:hyperlink w:anchor="_Toc226056558" w:history="1">
+            <w:r>
+              <w:rPr>
+                <w:rStyle w:val="Hyperlink"/>
+                <w:noProof/>
+              </w:rPr>
+              <w:t>Basic System design</w:t>
+            </w:r>
+            <w:r>
+              <w:rPr>
+                <w:noProof/>
+                <w:webHidden/>
+              </w:rPr>
+              <w:tab/>
+            </w:r>
+            <w:r>
+              <w:rPr>
+                <w:noProof/>
+                <w:webHidden/>
+              </w:rPr>
+              <w:fldChar w:fldCharType="begin"/>
+            </w:r>
+            <w:r>
+              <w:rPr>
+                <w:noProof/>
+                <w:webHidden/>
+              </w:rPr>
+              <w:instrText xml:space="preserve"> PAGEREF _Toc226056558 \h </w:instrText>
+            </w:r>
+            <w:r>
+              <w:rPr>
+                <w:noProof/>
+                <w:webHidden/>
+              </w:rPr>
+            </w:r>
+            <w:r>
+              <w:rPr>
+                <w:noProof/>
+                <w:webHidden/>
+              </w:rPr>
+              <w:fldChar w:fldCharType="separate"/>
+            </w:r>
+            <w:r>
+              <w:rPr>
+                <w:noProof/>
+                <w:webHidden/>
+              </w:rPr>
+              <w:t>4</w:t>
             </w:r>
             <w:r>
               <w:rPr>
@@ -1251,7 +1471,7 @@
               <w:sz w:val="24"/>
             </w:rPr>
           </w:pPr>
-          <w:hyperlink w:anchor="_Toc225441071" w:history="1">
+          <w:hyperlink w:anchor="_Toc226056559" w:history="1">
             <w:r>
               <w:rPr>
                 <w:rStyle w:val="Hyperlink"/>
@@ -1278,7 +1498,7 @@
                 <w:noProof/>
                 <w:webHidden/>
               </w:rPr>
-              <w:instrText xml:space="preserve"> PAGEREF _Toc225441071 \h </w:instrText>
+              <w:instrText xml:space="preserve"> PAGEREF _Toc226056559 \h </w:instrText>
             </w:r>
             <w:r>
               <w:rPr>
@@ -1298,7 +1518,7 @@
                 <w:noProof/>
                 <w:webHidden/>
               </w:rPr>
-              <w:t>3</w:t>
+              <w:t>4</w:t>
             </w:r>
             <w:r>
               <w:rPr>
@@ -1322,7 +1542,7 @@
               <w:sz w:val="24"/>
             </w:rPr>
           </w:pPr>
-          <w:hyperlink w:anchor="_Toc225441072" w:history="1">
+          <w:hyperlink w:anchor="_Toc226056560" w:history="1">
             <w:r>
               <w:rPr>
                 <w:rStyle w:val="Hyperlink"/>
@@ -1349,7 +1569,7 @@
                 <w:noProof/>
                 <w:webHidden/>
               </w:rPr>
-              <w:instrText xml:space="preserve"> PAGEREF _Toc225441072 \h </w:instrText>
+              <w:instrText xml:space="preserve"> PAGEREF _Toc226056560 \h </w:instrText>
             </w:r>
             <w:r>
               <w:rPr>
@@ -1369,7 +1589,78 @@
                 <w:noProof/>
                 <w:webHidden/>
               </w:rPr>
-              <w:t>3</w:t>
+              <w:t>4</w:t>
+            </w:r>
+            <w:r>
+              <w:rPr>
+                <w:noProof/>
+                <w:webHidden/>
+              </w:rPr>
+              <w:fldChar w:fldCharType="end"/>
+            </w:r>
+          </w:hyperlink>
+        </w:p>
+        <w:p>
+          <w:pPr>
+            <w:pStyle w:val="TOC3"/>
+            <w:tabs>
+              <w:tab w:val="right" w:leader="dot" w:pos="9350"/>
+            </w:tabs>
+            <w:rPr>
+              <w:rFonts w:asciiTheme="minorHAnsi" w:eastAsiaTheme="minorEastAsia" w:hAnsiTheme="minorHAnsi" w:cstheme="minorBidi"/>
+              <w:noProof/>
+              <w:color w:val="auto"/>
+              <w:sz w:val="24"/>
+            </w:rPr>
+          </w:pPr>
+          <w:hyperlink w:anchor="_Toc226056561" w:history="1">
+            <w:r>
+              <w:rPr>
+                <w:rStyle w:val="Hyperlink"/>
+                <w:noProof/>
+              </w:rPr>
+              <w:t>System design</w:t>
+            </w:r>
+            <w:r>
+              <w:rPr>
+                <w:noProof/>
+                <w:webHidden/>
+              </w:rPr>
+              <w:tab/>
+            </w:r>
+            <w:r>
+              <w:rPr>
+                <w:noProof/>
+                <w:webHidden/>
+              </w:rPr>
+              <w:fldChar w:fldCharType="begin"/>
+            </w:r>
+            <w:r>
+              <w:rPr>
+                <w:noProof/>
+                <w:webHidden/>
+              </w:rPr>
+              <w:instrText xml:space="preserve"> PAGEREF _Toc226056561 \h </w:instrText>
+            </w:r>
+            <w:r>
+              <w:rPr>
+                <w:noProof/>
+                <w:webHidden/>
+              </w:rPr>
+            </w:r>
+            <w:r>
+              <w:rPr>
+                <w:noProof/>
+                <w:webHidden/>
+              </w:rPr>
+              <w:fldChar w:fldCharType="separate"/>
+            </w:r>
+            <w:r>
+              <w:rPr>
+                <w:noProof/>
+                <w:webHidden/>
+              </w:rPr>
+              <w:t>4</w:t>
             </w:r>
             <w:r>
               <w:rPr>
@@ -1393,7 +1684,7 @@
               <w:sz w:val="24"/>
             </w:rPr>
           </w:pPr>
-          <w:hyperlink w:anchor="_Toc225441073" w:history="1">
+          <w:hyperlink w:anchor="_Toc226056562" w:history="1">
             <w:r>
               <w:rPr>
                 <w:rStyle w:val="Hyperlink"/>
@@ -1420,7 +1711,7 @@
                 <w:noProof/>
                 <w:webHidden/>
               </w:rPr>
-              <w:instrText xml:space="preserve"> PAGEREF _Toc225441073 \h </w:instrText>
+              <w:instrText xml:space="preserve"> PAGEREF _Toc226056562 \h </w:instrText>
             </w:r>
             <w:r>
               <w:rPr>
@@ -1440,7 +1731,7 @@
                 <w:noProof/>
                 <w:webHidden/>
               </w:rPr>
-              <w:t>3</w:t>
+              <w:t>5</w:t>
             </w:r>
             <w:r>
               <w:rPr>
@@ -1464,7 +1755,7 @@
               <w:sz w:val="24"/>
             </w:rPr>
           </w:pPr>
-          <w:hyperlink w:anchor="_Toc225441074" w:history="1">
+          <w:hyperlink w:anchor="_Toc226056563" w:history="1">
             <w:r>
               <w:rPr>
                 <w:rStyle w:val="Hyperlink"/>
@@ -1491,7 +1782,7 @@
                 <w:noProof/>
                 <w:webHidden/>
               </w:rPr>
-              <w:instrText xml:space="preserve"> PAGEREF _Toc225441074 \h </w:instrText>
+              <w:instrText xml:space="preserve"> PAGEREF _Toc226056563 \h </w:instrText>
             </w:r>
             <w:r>
               <w:rPr>
@@ -1511,7 +1802,291 @@
                 <w:noProof/>
                 <w:webHidden/>
               </w:rPr>
-              <w:t>3</w:t>
+              <w:t>5</w:t>
+            </w:r>
+            <w:r>
+              <w:rPr>
+                <w:noProof/>
+                <w:webHidden/>
+              </w:rPr>
+              <w:fldChar w:fldCharType="end"/>
+            </w:r>
+          </w:hyperlink>
+        </w:p>
+        <w:p>
+          <w:pPr>
+            <w:pStyle w:val="TOC3"/>
+            <w:tabs>
+              <w:tab w:val="right" w:leader="dot" w:pos="9350"/>
+            </w:tabs>
+            <w:rPr>
+              <w:rFonts w:asciiTheme="minorHAnsi" w:eastAsiaTheme="minorEastAsia" w:hAnsiTheme="minorHAnsi" w:cstheme="minorBidi"/>
+              <w:noProof/>
+              <w:color w:val="auto"/>
+              <w:sz w:val="24"/>
+            </w:rPr>
+          </w:pPr>
+          <w:hyperlink w:anchor="_Toc226056564" w:history="1">
+            <w:r>
+              <w:rPr>
+                <w:rStyle w:val="Hyperlink"/>
+                <w:noProof/>
+              </w:rPr>
+              <w:t>Which parts of the system is being done.</w:t>
+            </w:r>
+            <w:r>
+              <w:rPr>
+                <w:noProof/>
+                <w:webHidden/>
+              </w:rPr>
+              <w:tab/>
+            </w:r>
+            <w:r>
+              <w:rPr>
+                <w:noProof/>
+                <w:webHidden/>
+              </w:rPr>
+              <w:fldChar w:fldCharType="begin"/>
+            </w:r>
+            <w:r>
+              <w:rPr>
+                <w:noProof/>
+                <w:webHidden/>
+              </w:rPr>
+              <w:instrText xml:space="preserve"> PAGEREF _Toc226056564 \h </w:instrText>
+            </w:r>
+            <w:r>
+              <w:rPr>
+                <w:noProof/>
+                <w:webHidden/>
+              </w:rPr>
+            </w:r>
+            <w:r>
+              <w:rPr>
+                <w:noProof/>
+                <w:webHidden/>
+              </w:rPr>
+              <w:fldChar w:fldCharType="separate"/>
+            </w:r>
+            <w:r>
+              <w:rPr>
+                <w:noProof/>
+                <w:webHidden/>
+              </w:rPr>
+              <w:t>5</w:t>
+            </w:r>
+            <w:r>
+              <w:rPr>
+                <w:noProof/>
+                <w:webHidden/>
+              </w:rPr>
+              <w:fldChar w:fldCharType="end"/>
+            </w:r>
+          </w:hyperlink>
+        </w:p>
+        <w:p>
+          <w:pPr>
+            <w:pStyle w:val="TOC3"/>
+            <w:tabs>
+              <w:tab w:val="right" w:leader="dot" w:pos="9350"/>
+            </w:tabs>
+            <w:rPr>
+              <w:rFonts w:asciiTheme="minorHAnsi" w:eastAsiaTheme="minorEastAsia" w:hAnsiTheme="minorHAnsi" w:cstheme="minorBidi"/>
+              <w:noProof/>
+              <w:color w:val="auto"/>
+              <w:sz w:val="24"/>
+            </w:rPr>
+          </w:pPr>
+          <w:hyperlink w:anchor="_Toc226056565" w:history="1">
+            <w:r>
+              <w:rPr>
+                <w:rStyle w:val="Hyperlink"/>
+                <w:noProof/>
+              </w:rPr>
+              <w:t>Who’s doing what</w:t>
+            </w:r>
+            <w:r>
+              <w:rPr>
+                <w:noProof/>
+                <w:webHidden/>
+              </w:rPr>
+              <w:tab/>
+            </w:r>
+            <w:r>
+              <w:rPr>
+                <w:noProof/>
+                <w:webHidden/>
+              </w:rPr>
+              <w:fldChar w:fldCharType="begin"/>
+            </w:r>
+            <w:r>
+              <w:rPr>
+                <w:noProof/>
+                <w:webHidden/>
+              </w:rPr>
+              <w:instrText xml:space="preserve"> PAGEREF _Toc226056565 \h </w:instrText>
+            </w:r>
+            <w:r>
+              <w:rPr>
+                <w:noProof/>
+                <w:webHidden/>
+              </w:rPr>
+            </w:r>
+            <w:r>
+              <w:rPr>
+                <w:noProof/>
+                <w:webHidden/>
+              </w:rPr>
+              <w:fldChar w:fldCharType="separate"/>
+            </w:r>
+            <w:r>
+              <w:rPr>
+                <w:noProof/>
+                <w:webHidden/>
+              </w:rPr>
+              <w:t>5</w:t>
+            </w:r>
+            <w:r>
+              <w:rPr>
+                <w:noProof/>
+                <w:webHidden/>
+              </w:rPr>
+              <w:fldChar w:fldCharType="end"/>
+            </w:r>
+          </w:hyperlink>
+        </w:p>
+        <w:p>
+          <w:pPr>
+            <w:pStyle w:val="TOC3"/>
+            <w:tabs>
+              <w:tab w:val="right" w:leader="dot" w:pos="9350"/>
+            </w:tabs>
+            <w:rPr>
+              <w:rFonts w:asciiTheme="minorHAnsi" w:eastAsiaTheme="minorEastAsia" w:hAnsiTheme="minorHAnsi" w:cstheme="minorBidi"/>
+              <w:noProof/>
+              <w:color w:val="auto"/>
+              <w:sz w:val="24"/>
+            </w:rPr>
+          </w:pPr>
+          <w:hyperlink w:anchor="_Toc226056566" w:history="1">
+            <w:r>
+              <w:rPr>
+                <w:rStyle w:val="Hyperlink"/>
+                <w:noProof/>
+              </w:rPr>
+              <w:t>Timeline</w:t>
+            </w:r>
+            <w:r>
+              <w:rPr>
+                <w:noProof/>
+                <w:webHidden/>
+              </w:rPr>
+              <w:tab/>
+            </w:r>
+            <w:r>
+              <w:rPr>
+                <w:noProof/>
+                <w:webHidden/>
+              </w:rPr>
+              <w:fldChar w:fldCharType="begin"/>
+            </w:r>
+            <w:r>
+              <w:rPr>
+                <w:noProof/>
+                <w:webHidden/>
+              </w:rPr>
+              <w:instrText xml:space="preserve"> PAGEREF _Toc226056566 \h </w:instrText>
+            </w:r>
+            <w:r>
+              <w:rPr>
+                <w:noProof/>
+                <w:webHidden/>
+              </w:rPr>
+            </w:r>
+            <w:r>
+              <w:rPr>
+                <w:noProof/>
+                <w:webHidden/>
+              </w:rPr>
+              <w:fldChar w:fldCharType="separate"/>
+            </w:r>
+            <w:r>
+              <w:rPr>
+                <w:noProof/>
+                <w:webHidden/>
+              </w:rPr>
+              <w:t>5</w:t>
+            </w:r>
+            <w:r>
+              <w:rPr>
+                <w:noProof/>
+                <w:webHidden/>
+              </w:rPr>
+              <w:fldChar w:fldCharType="end"/>
+            </w:r>
+          </w:hyperlink>
+        </w:p>
+        <w:p>
+          <w:pPr>
+            <w:pStyle w:val="TOC3"/>
+            <w:tabs>
+              <w:tab w:val="right" w:leader="dot" w:pos="9350"/>
+            </w:tabs>
+            <w:rPr>
+              <w:rFonts w:asciiTheme="minorHAnsi" w:eastAsiaTheme="minorEastAsia" w:hAnsiTheme="minorHAnsi" w:cstheme="minorBidi"/>
+              <w:noProof/>
+              <w:color w:val="auto"/>
+              <w:sz w:val="24"/>
+            </w:rPr>
+          </w:pPr>
+          <w:hyperlink w:anchor="_Toc226056567" w:history="1">
+            <w:r>
+              <w:rPr>
+                <w:rStyle w:val="Hyperlink"/>
+                <w:noProof/>
+              </w:rPr>
+              <w:t>Start date</w:t>
+            </w:r>
+            <w:r>
+              <w:rPr>
+                <w:noProof/>
+                <w:webHidden/>
+              </w:rPr>
+              <w:tab/>
+            </w:r>
+            <w:r>
+              <w:rPr>
+                <w:noProof/>
+                <w:webHidden/>
+              </w:rPr>
+              <w:fldChar w:fldCharType="begin"/>
+            </w:r>
+            <w:r>
+              <w:rPr>
+                <w:noProof/>
+                <w:webHidden/>
+              </w:rPr>
+              <w:instrText xml:space="preserve"> PAGEREF _Toc226056567 \h </w:instrText>
+            </w:r>
+            <w:r>
+              <w:rPr>
+                <w:noProof/>
+                <w:webHidden/>
+              </w:rPr>
+            </w:r>
+            <w:r>
+              <w:rPr>
+                <w:noProof/>
+                <w:webHidden/>
+              </w:rPr>
+              <w:fldChar w:fldCharType="separate"/>
+            </w:r>
+            <w:r>
+              <w:rPr>
+                <w:noProof/>
+                <w:webHidden/>
+              </w:rPr>
+              <w:t>5</w:t>
             </w:r>
             <w:r>
               <w:rPr>
@@ -1535,7 +2110,7 @@
               <w:sz w:val="24"/>
             </w:rPr>
           </w:pPr>
-          <w:hyperlink w:anchor="_Toc225441075" w:history="1">
+          <w:hyperlink w:anchor="_Toc226056568" w:history="1">
             <w:r>
               <w:rPr>
                 <w:rStyle w:val="Hyperlink"/>
@@ -1562,7 +2137,7 @@
                 <w:noProof/>
                 <w:webHidden/>
               </w:rPr>
-              <w:instrText xml:space="preserve"> PAGEREF _Toc225441075 \h </w:instrText>
+              <w:instrText xml:space="preserve"> PAGEREF _Toc226056568 \h </w:instrText>
             </w:r>
             <w:r>
               <w:rPr>
@@ -1582,7 +2157,220 @@
                 <w:noProof/>
                 <w:webHidden/>
               </w:rPr>
-              <w:t>3</w:t>
+              <w:t>5</w:t>
+            </w:r>
+            <w:r>
+              <w:rPr>
+                <w:noProof/>
+                <w:webHidden/>
+              </w:rPr>
+              <w:fldChar w:fldCharType="end"/>
+            </w:r>
+          </w:hyperlink>
+        </w:p>
+        <w:p>
+          <w:pPr>
+            <w:pStyle w:val="TOC3"/>
+            <w:tabs>
+              <w:tab w:val="right" w:leader="dot" w:pos="9350"/>
+            </w:tabs>
+            <w:rPr>
+              <w:rFonts w:asciiTheme="minorHAnsi" w:eastAsiaTheme="minorEastAsia" w:hAnsiTheme="minorHAnsi" w:cstheme="minorBidi"/>
+              <w:noProof/>
+              <w:color w:val="auto"/>
+              <w:sz w:val="24"/>
+            </w:rPr>
+          </w:pPr>
+          <w:hyperlink w:anchor="_Toc226056569" w:history="1">
+            <w:r>
+              <w:rPr>
+                <w:rStyle w:val="Hyperlink"/>
+                <w:noProof/>
+              </w:rPr>
+              <w:t>Which parts of the system is being tested.</w:t>
+            </w:r>
+            <w:r>
+              <w:rPr>
+                <w:noProof/>
+                <w:webHidden/>
+              </w:rPr>
+              <w:tab/>
+            </w:r>
+            <w:r>
+              <w:rPr>
+                <w:noProof/>
+                <w:webHidden/>
+              </w:rPr>
+              <w:fldChar w:fldCharType="begin"/>
+            </w:r>
+            <w:r>
+              <w:rPr>
+                <w:noProof/>
+                <w:webHidden/>
+              </w:rPr>
+              <w:instrText xml:space="preserve"> PAGEREF _Toc226056569 \h </w:instrText>
+            </w:r>
+            <w:r>
+              <w:rPr>
+                <w:noProof/>
+                <w:webHidden/>
+              </w:rPr>
+            </w:r>
+            <w:r>
+              <w:rPr>
+                <w:noProof/>
+                <w:webHidden/>
+              </w:rPr>
+              <w:fldChar w:fldCharType="separate"/>
+            </w:r>
+            <w:r>
+              <w:rPr>
+                <w:noProof/>
+                <w:webHidden/>
+              </w:rPr>
+              <w:t>5</w:t>
+            </w:r>
+            <w:r>
+              <w:rPr>
+                <w:noProof/>
+                <w:webHidden/>
+              </w:rPr>
+              <w:fldChar w:fldCharType="end"/>
+            </w:r>
+          </w:hyperlink>
+        </w:p>
+        <w:p>
+          <w:pPr>
+            <w:pStyle w:val="TOC3"/>
+            <w:tabs>
+              <w:tab w:val="right" w:leader="dot" w:pos="9350"/>
+            </w:tabs>
+            <w:rPr>
+              <w:rFonts w:asciiTheme="minorHAnsi" w:eastAsiaTheme="minorEastAsia" w:hAnsiTheme="minorHAnsi" w:cstheme="minorBidi"/>
+              <w:noProof/>
+              <w:color w:val="auto"/>
+              <w:sz w:val="24"/>
+            </w:rPr>
+          </w:pPr>
+          <w:hyperlink w:anchor="_Toc226056570" w:history="1">
+            <w:r>
+              <w:rPr>
+                <w:rStyle w:val="Hyperlink"/>
+                <w:noProof/>
+              </w:rPr>
+              <w:t>Who’s doing it</w:t>
+            </w:r>
+            <w:r>
+              <w:rPr>
+                <w:noProof/>
+                <w:webHidden/>
+              </w:rPr>
+              <w:tab/>
+            </w:r>
+            <w:r>
+              <w:rPr>
+                <w:noProof/>
+                <w:webHidden/>
+              </w:rPr>
+              <w:fldChar w:fldCharType="begin"/>
+            </w:r>
+            <w:r>
+              <w:rPr>
+                <w:noProof/>
+                <w:webHidden/>
+              </w:rPr>
+              <w:instrText xml:space="preserve"> PAGEREF _Toc226056570 \h </w:instrText>
+            </w:r>
+            <w:r>
+              <w:rPr>
+                <w:noProof/>
+                <w:webHidden/>
+              </w:rPr>
+            </w:r>
+            <w:r>
+              <w:rPr>
+                <w:noProof/>
+                <w:webHidden/>
+              </w:rPr>
+              <w:fldChar w:fldCharType="separate"/>
+            </w:r>
+            <w:r>
+              <w:rPr>
+                <w:noProof/>
+                <w:webHidden/>
+              </w:rPr>
+              <w:t>6</w:t>
+            </w:r>
+            <w:r>
+              <w:rPr>
+                <w:noProof/>
+                <w:webHidden/>
+              </w:rPr>
+              <w:fldChar w:fldCharType="end"/>
+            </w:r>
+          </w:hyperlink>
+        </w:p>
+        <w:p>
+          <w:pPr>
+            <w:pStyle w:val="TOC1"/>
+            <w:tabs>
+              <w:tab w:val="right" w:leader="dot" w:pos="9350"/>
+            </w:tabs>
+            <w:rPr>
+              <w:rFonts w:asciiTheme="minorHAnsi" w:eastAsiaTheme="minorEastAsia" w:hAnsiTheme="minorHAnsi" w:cstheme="minorBidi"/>
+              <w:noProof/>
+              <w:color w:val="auto"/>
+              <w:sz w:val="24"/>
+            </w:rPr>
+          </w:pPr>
+          <w:hyperlink w:anchor="_Toc226056571" w:history="1">
+            <w:r>
+              <w:rPr>
+                <w:rStyle w:val="Hyperlink"/>
+                <w:noProof/>
+              </w:rPr>
+              <w:t>Next Steps</w:t>
+            </w:r>
+            <w:r>
+              <w:rPr>
+                <w:noProof/>
+                <w:webHidden/>
+              </w:rPr>
+              <w:tab/>
+            </w:r>
+            <w:r>
+              <w:rPr>
+                <w:noProof/>
+                <w:webHidden/>
+              </w:rPr>
+              <w:fldChar w:fldCharType="begin"/>
+            </w:r>
+            <w:r>
+              <w:rPr>
+                <w:noProof/>
+                <w:webHidden/>
+              </w:rPr>
+              <w:instrText xml:space="preserve"> PAGEREF _Toc226056571 \h </w:instrText>
+            </w:r>
+            <w:r>
+              <w:rPr>
+                <w:noProof/>
+                <w:webHidden/>
+              </w:rPr>
+            </w:r>
+            <w:r>
+              <w:rPr>
+                <w:noProof/>
+                <w:webHidden/>
+              </w:rPr>
+              <w:fldChar w:fldCharType="separate"/>
+            </w:r>
+            <w:r>
+              <w:rPr>
+                <w:noProof/>
+                <w:webHidden/>
+              </w:rPr>
+              <w:t>6</w:t>
             </w:r>
             <w:r>
               <w:rPr>
@@ -1606,13 +2394,13 @@
               <w:sz w:val="24"/>
             </w:rPr>
           </w:pPr>
-          <w:hyperlink w:anchor="_Toc225441076" w:history="1">
+          <w:hyperlink w:anchor="_Toc226056572" w:history="1">
             <w:r>
               <w:rPr>
                 <w:rStyle w:val="Hyperlink"/>
                 <w:noProof/>
               </w:rPr>
-              <w:t>Changes to Design</w:t>
+              <w:t>Upcoming Features</w:t>
             </w:r>
             <w:r>
               <w:rPr>
@@ -1633,7 +2421,7 @@
                 <w:noProof/>
                 <w:webHidden/>
               </w:rPr>
-              <w:instrText xml:space="preserve"> PAGEREF _Toc225441076 \h </w:instrText>
+              <w:instrText xml:space="preserve"> PAGEREF _Toc226056572 \h </w:instrText>
             </w:r>
             <w:r>
               <w:rPr>
@@ -1653,7 +2441,7 @@
                 <w:noProof/>
                 <w:webHidden/>
               </w:rPr>
-              <w:t>3</w:t>
+              <w:t>6</w:t>
             </w:r>
             <w:r>
               <w:rPr>
@@ -1677,13 +2465,13 @@
               <w:sz w:val="24"/>
             </w:rPr>
           </w:pPr>
-          <w:hyperlink w:anchor="_Toc225441077" w:history="1">
+          <w:hyperlink w:anchor="_Toc226056573" w:history="1">
             <w:r>
               <w:rPr>
                 <w:rStyle w:val="Hyperlink"/>
                 <w:noProof/>
               </w:rPr>
-              <w:t>Next Steps</w:t>
+              <w:t>Issues, Risks, or Challenges</w:t>
             </w:r>
             <w:r>
               <w:rPr>
@@ -1704,7 +2492,7 @@
                 <w:noProof/>
                 <w:webHidden/>
               </w:rPr>
-              <w:instrText xml:space="preserve"> PAGEREF _Toc225441077 \h </w:instrText>
+              <w:instrText xml:space="preserve"> PAGEREF _Toc226056573 \h </w:instrText>
             </w:r>
             <w:r>
               <w:rPr>
@@ -1724,7 +2512,7 @@
                 <w:noProof/>
                 <w:webHidden/>
               </w:rPr>
-              <w:t>4</w:t>
+              <w:t>6</w:t>
             </w:r>
             <w:r>
               <w:rPr>
@@ -1748,13 +2536,13 @@
               <w:sz w:val="24"/>
             </w:rPr>
           </w:pPr>
-          <w:hyperlink w:anchor="_Toc225441078" w:history="1">
+          <w:hyperlink w:anchor="_Toc226056574" w:history="1">
             <w:r>
               <w:rPr>
                 <w:rStyle w:val="Hyperlink"/>
                 <w:noProof/>
               </w:rPr>
-              <w:t>Upcoming Features</w:t>
+              <w:t>Roadblocks</w:t>
             </w:r>
             <w:r>
               <w:rPr>
@@ -1775,7 +2563,7 @@
                 <w:noProof/>
                 <w:webHidden/>
               </w:rPr>
-              <w:instrText xml:space="preserve"> PAGEREF _Toc225441078 \h </w:instrText>
+              <w:instrText xml:space="preserve"> PAGEREF _Toc226056574 \h </w:instrText>
             </w:r>
             <w:r>
               <w:rPr>
@@ -1795,7 +2583,149 @@
                 <w:noProof/>
                 <w:webHidden/>
               </w:rPr>
-              <w:t>4</w:t>
+              <w:t>6</w:t>
+            </w:r>
+            <w:r>
+              <w:rPr>
+                <w:noProof/>
+                <w:webHidden/>
+              </w:rPr>
+              <w:fldChar w:fldCharType="end"/>
+            </w:r>
+          </w:hyperlink>
+        </w:p>
+        <w:p>
+          <w:pPr>
+            <w:pStyle w:val="TOC3"/>
+            <w:tabs>
+              <w:tab w:val="right" w:leader="dot" w:pos="9350"/>
+            </w:tabs>
+            <w:rPr>
+              <w:rFonts w:asciiTheme="minorHAnsi" w:eastAsiaTheme="minorEastAsia" w:hAnsiTheme="minorHAnsi" w:cstheme="minorBidi"/>
+              <w:noProof/>
+              <w:color w:val="auto"/>
+              <w:sz w:val="24"/>
+            </w:rPr>
+          </w:pPr>
+          <w:hyperlink w:anchor="_Toc226056575" w:history="1">
+            <w:r>
+              <w:rPr>
+                <w:rStyle w:val="Hyperlink"/>
+                <w:noProof/>
+              </w:rPr>
+              <w:t>Programmatic Delays</w:t>
+            </w:r>
+            <w:r>
+              <w:rPr>
+                <w:noProof/>
+                <w:webHidden/>
+              </w:rPr>
+              <w:tab/>
+            </w:r>
+            <w:r>
+              <w:rPr>
+                <w:noProof/>
+                <w:webHidden/>
+              </w:rPr>
+              <w:fldChar w:fldCharType="begin"/>
+            </w:r>
+            <w:r>
+              <w:rPr>
+                <w:noProof/>
+                <w:webHidden/>
+              </w:rPr>
+              <w:instrText xml:space="preserve"> PAGEREF _Toc226056575 \h </w:instrText>
+            </w:r>
+            <w:r>
+              <w:rPr>
+                <w:noProof/>
+                <w:webHidden/>
+              </w:rPr>
+            </w:r>
+            <w:r>
+              <w:rPr>
+                <w:noProof/>
+                <w:webHidden/>
+              </w:rPr>
+              <w:fldChar w:fldCharType="separate"/>
+            </w:r>
+            <w:r>
+              <w:rPr>
+                <w:noProof/>
+                <w:webHidden/>
+              </w:rPr>
+              <w:t>6</w:t>
+            </w:r>
+            <w:r>
+              <w:rPr>
+                <w:noProof/>
+                <w:webHidden/>
+              </w:rPr>
+              <w:fldChar w:fldCharType="end"/>
+            </w:r>
+          </w:hyperlink>
+        </w:p>
+        <w:p>
+          <w:pPr>
+            <w:pStyle w:val="TOC3"/>
+            <w:tabs>
+              <w:tab w:val="right" w:leader="dot" w:pos="9350"/>
+            </w:tabs>
+            <w:rPr>
+              <w:rFonts w:asciiTheme="minorHAnsi" w:eastAsiaTheme="minorEastAsia" w:hAnsiTheme="minorHAnsi" w:cstheme="minorBidi"/>
+              <w:noProof/>
+              <w:color w:val="auto"/>
+              <w:sz w:val="24"/>
+            </w:rPr>
+          </w:pPr>
+          <w:hyperlink w:anchor="_Toc226056576" w:history="1">
+            <w:r>
+              <w:rPr>
+                <w:rStyle w:val="Hyperlink"/>
+                <w:noProof/>
+              </w:rPr>
+              <w:t>Non-Programmatic Delays</w:t>
+            </w:r>
+            <w:r>
+              <w:rPr>
+                <w:noProof/>
+                <w:webHidden/>
+              </w:rPr>
+              <w:tab/>
+            </w:r>
+            <w:r>
+              <w:rPr>
+                <w:noProof/>
+                <w:webHidden/>
+              </w:rPr>
+              <w:fldChar w:fldCharType="begin"/>
+            </w:r>
+            <w:r>
+              <w:rPr>
+                <w:noProof/>
+                <w:webHidden/>
+              </w:rPr>
+              <w:instrText xml:space="preserve"> PAGEREF _Toc226056576 \h </w:instrText>
+            </w:r>
+            <w:r>
+              <w:rPr>
+                <w:noProof/>
+                <w:webHidden/>
+              </w:rPr>
+            </w:r>
+            <w:r>
+              <w:rPr>
+                <w:noProof/>
+                <w:webHidden/>
+              </w:rPr>
+              <w:fldChar w:fldCharType="separate"/>
+            </w:r>
+            <w:r>
+              <w:rPr>
+                <w:noProof/>
+                <w:webHidden/>
+              </w:rPr>
+              <w:t>7</w:t>
             </w:r>
             <w:r>
               <w:rPr>
@@ -1819,13 +2749,13 @@
               <w:sz w:val="24"/>
             </w:rPr>
           </w:pPr>
-          <w:hyperlink w:anchor="_Toc225441079" w:history="1">
+          <w:hyperlink w:anchor="_Toc226056577" w:history="1">
             <w:r>
               <w:rPr>
                 <w:rStyle w:val="Hyperlink"/>
                 <w:noProof/>
               </w:rPr>
-              <w:t>Updates / Fixes</w:t>
+              <w:t>Dependencies</w:t>
             </w:r>
             <w:r>
               <w:rPr>
@@ -1846,7 +2776,7 @@
                 <w:noProof/>
                 <w:webHidden/>
               </w:rPr>
-              <w:instrText xml:space="preserve"> PAGEREF _Toc225441079 \h </w:instrText>
+              <w:instrText xml:space="preserve"> PAGEREF _Toc226056577 \h </w:instrText>
             </w:r>
             <w:r>
               <w:rPr>
@@ -1866,220 +2796,7 @@
                 <w:noProof/>
                 <w:webHidden/>
               </w:rPr>
-              <w:t>4</w:t>
-            </w:r>
-            <w:r>
-              <w:rPr>
-                <w:noProof/>
-                <w:webHidden/>
-              </w:rPr>
-              <w:fldChar w:fldCharType="end"/>
-            </w:r>
-          </w:hyperlink>
-        </w:p>
-        <w:p>
-          <w:pPr>
-            <w:pStyle w:val="TOC2"/>
-            <w:tabs>
-              <w:tab w:val="right" w:leader="dot" w:pos="9350"/>
-            </w:tabs>
-            <w:rPr>
-              <w:rFonts w:asciiTheme="minorHAnsi" w:eastAsiaTheme="minorEastAsia" w:hAnsiTheme="minorHAnsi" w:cstheme="minorBidi"/>
-              <w:noProof/>
-              <w:color w:val="auto"/>
-              <w:sz w:val="24"/>
-            </w:rPr>
-          </w:pPr>
-          <w:hyperlink w:anchor="_Toc225441080" w:history="1">
-            <w:r>
-              <w:rPr>
-                <w:rStyle w:val="Hyperlink"/>
-                <w:noProof/>
-              </w:rPr>
-              <w:t>Development Plan</w:t>
-            </w:r>
-            <w:r>
-              <w:rPr>
-                <w:noProof/>
-                <w:webHidden/>
-              </w:rPr>
-              <w:tab/>
-            </w:r>
-            <w:r>
-              <w:rPr>
-                <w:noProof/>
-                <w:webHidden/>
-              </w:rPr>
-              <w:fldChar w:fldCharType="begin"/>
-            </w:r>
-            <w:r>
-              <w:rPr>
-                <w:noProof/>
-                <w:webHidden/>
-              </w:rPr>
-              <w:instrText xml:space="preserve"> PAGEREF _Toc225441080 \h </w:instrText>
-            </w:r>
-            <w:r>
-              <w:rPr>
-                <w:noProof/>
-                <w:webHidden/>
-              </w:rPr>
-            </w:r>
-            <w:r>
-              <w:rPr>
-                <w:noProof/>
-                <w:webHidden/>
-              </w:rPr>
-              <w:fldChar w:fldCharType="separate"/>
-            </w:r>
-            <w:r>
-              <w:rPr>
-                <w:noProof/>
-                <w:webHidden/>
-              </w:rPr>
-              <w:t>4</w:t>
-            </w:r>
-            <w:r>
-              <w:rPr>
-                <w:noProof/>
-                <w:webHidden/>
-              </w:rPr>
-              <w:fldChar w:fldCharType="end"/>
-            </w:r>
-          </w:hyperlink>
-        </w:p>
-        <w:p>
-          <w:pPr>
-            <w:pStyle w:val="TOC1"/>
-            <w:tabs>
-              <w:tab w:val="right" w:leader="dot" w:pos="9350"/>
-            </w:tabs>
-            <w:rPr>
-              <w:rFonts w:asciiTheme="minorHAnsi" w:eastAsiaTheme="minorEastAsia" w:hAnsiTheme="minorHAnsi" w:cstheme="minorBidi"/>
-              <w:noProof/>
-              <w:color w:val="auto"/>
-              <w:sz w:val="24"/>
-            </w:rPr>
-          </w:pPr>
-          <w:hyperlink w:anchor="_Toc225441081" w:history="1">
-            <w:r>
-              <w:rPr>
-                <w:rStyle w:val="Hyperlink"/>
-                <w:noProof/>
-              </w:rPr>
-              <w:t>Issues, Risks, or Challenges</w:t>
-            </w:r>
-            <w:r>
-              <w:rPr>
-                <w:noProof/>
-                <w:webHidden/>
-              </w:rPr>
-              <w:tab/>
-            </w:r>
-            <w:r>
-              <w:rPr>
-                <w:noProof/>
-                <w:webHidden/>
-              </w:rPr>
-              <w:fldChar w:fldCharType="begin"/>
-            </w:r>
-            <w:r>
-              <w:rPr>
-                <w:noProof/>
-                <w:webHidden/>
-              </w:rPr>
-              <w:instrText xml:space="preserve"> PAGEREF _Toc225441081 \h </w:instrText>
-            </w:r>
-            <w:r>
-              <w:rPr>
-                <w:noProof/>
-                <w:webHidden/>
-              </w:rPr>
-            </w:r>
-            <w:r>
-              <w:rPr>
-                <w:noProof/>
-                <w:webHidden/>
-              </w:rPr>
-              <w:fldChar w:fldCharType="separate"/>
-            </w:r>
-            <w:r>
-              <w:rPr>
-                <w:noProof/>
-                <w:webHidden/>
-              </w:rPr>
-              <w:t>4</w:t>
-            </w:r>
-            <w:r>
-              <w:rPr>
-                <w:noProof/>
-                <w:webHidden/>
-              </w:rPr>
-              <w:fldChar w:fldCharType="end"/>
-            </w:r>
-          </w:hyperlink>
-        </w:p>
-        <w:p>
-          <w:pPr>
-            <w:pStyle w:val="TOC2"/>
-            <w:tabs>
-              <w:tab w:val="right" w:leader="dot" w:pos="9350"/>
-            </w:tabs>
-            <w:rPr>
-              <w:rFonts w:asciiTheme="minorHAnsi" w:eastAsiaTheme="minorEastAsia" w:hAnsiTheme="minorHAnsi" w:cstheme="minorBidi"/>
-              <w:noProof/>
-              <w:color w:val="auto"/>
-              <w:sz w:val="24"/>
-            </w:rPr>
-          </w:pPr>
-          <w:hyperlink w:anchor="_Toc225441082" w:history="1">
-            <w:r>
-              <w:rPr>
-                <w:rStyle w:val="Hyperlink"/>
-                <w:noProof/>
-              </w:rPr>
-              <w:t>Roadblocks</w:t>
-            </w:r>
-            <w:r>
-              <w:rPr>
-                <w:noProof/>
-                <w:webHidden/>
-              </w:rPr>
-              <w:tab/>
-            </w:r>
-            <w:r>
-              <w:rPr>
-                <w:noProof/>
-                <w:webHidden/>
-              </w:rPr>
-              <w:fldChar w:fldCharType="begin"/>
-            </w:r>
-            <w:r>
-              <w:rPr>
-                <w:noProof/>
-                <w:webHidden/>
-              </w:rPr>
-              <w:instrText xml:space="preserve"> PAGEREF _Toc225441082 \h </w:instrText>
-            </w:r>
-            <w:r>
-              <w:rPr>
-                <w:noProof/>
-                <w:webHidden/>
-              </w:rPr>
-            </w:r>
-            <w:r>
-              <w:rPr>
-                <w:noProof/>
-                <w:webHidden/>
-              </w:rPr>
-              <w:fldChar w:fldCharType="separate"/>
-            </w:r>
-            <w:r>
-              <w:rPr>
-                <w:noProof/>
-                <w:webHidden/>
-              </w:rPr>
-              <w:t>4</w:t>
+              <w:t>7</w:t>
             </w:r>
             <w:r>
               <w:rPr>
@@ -2103,13 +2820,13 @@
               <w:sz w:val="24"/>
             </w:rPr>
           </w:pPr>
-          <w:hyperlink w:anchor="_Toc225441083" w:history="1">
+          <w:hyperlink w:anchor="_Toc226056578" w:history="1">
             <w:r>
               <w:rPr>
                 <w:rStyle w:val="Hyperlink"/>
                 <w:noProof/>
               </w:rPr>
-              <w:t>Programmatic Delays</w:t>
+              <w:t>External libraries</w:t>
             </w:r>
             <w:r>
               <w:rPr>
@@ -2130,7 +2847,7 @@
                 <w:noProof/>
                 <w:webHidden/>
               </w:rPr>
-              <w:instrText xml:space="preserve"> PAGEREF _Toc225441083 \h </w:instrText>
+              <w:instrText xml:space="preserve"> PAGEREF _Toc226056578 \h </w:instrText>
             </w:r>
             <w:r>
               <w:rPr>
@@ -2150,7 +2867,7 @@
                 <w:noProof/>
                 <w:webHidden/>
               </w:rPr>
-              <w:t>4</w:t>
+              <w:t>7</w:t>
             </w:r>
             <w:r>
               <w:rPr>
@@ -2174,13 +2891,13 @@
               <w:sz w:val="24"/>
             </w:rPr>
           </w:pPr>
-          <w:hyperlink w:anchor="_Toc225441084" w:history="1">
+          <w:hyperlink w:anchor="_Toc226056579" w:history="1">
             <w:r>
               <w:rPr>
                 <w:rStyle w:val="Hyperlink"/>
                 <w:noProof/>
               </w:rPr>
-              <w:t>Non-Programmatic Delays</w:t>
+              <w:t>Programming languages</w:t>
             </w:r>
             <w:r>
               <w:rPr>
@@ -2201,7 +2918,7 @@
                 <w:noProof/>
                 <w:webHidden/>
               </w:rPr>
-              <w:instrText xml:space="preserve"> PAGEREF _Toc225441084 \h </w:instrText>
+              <w:instrText xml:space="preserve"> PAGEREF _Toc226056579 \h </w:instrText>
             </w:r>
             <w:r>
               <w:rPr>
@@ -2221,7 +2938,7 @@
                 <w:noProof/>
                 <w:webHidden/>
               </w:rPr>
-              <w:t>4</w:t>
+              <w:t>7</w:t>
             </w:r>
             <w:r>
               <w:rPr>
@@ -2234,7 +2951,7 @@
         </w:p>
         <w:p>
           <w:pPr>
-            <w:pStyle w:val="TOC2"/>
+            <w:pStyle w:val="TOC3"/>
             <w:tabs>
               <w:tab w:val="right" w:leader="dot" w:pos="9350"/>
             </w:tabs>
@@ -2245,13 +2962,13 @@
               <w:sz w:val="24"/>
             </w:rPr>
           </w:pPr>
-          <w:hyperlink w:anchor="_Toc225441085" w:history="1">
+          <w:hyperlink w:anchor="_Toc226056580" w:history="1">
             <w:r>
               <w:rPr>
                 <w:rStyle w:val="Hyperlink"/>
                 <w:noProof/>
               </w:rPr>
-              <w:t>Dependencies</w:t>
+              <w:t>Database server and queries</w:t>
             </w:r>
             <w:r>
               <w:rPr>
@@ -2272,7 +2989,7 @@
                 <w:noProof/>
                 <w:webHidden/>
               </w:rPr>
-              <w:instrText xml:space="preserve"> PAGEREF _Toc225441085 \h </w:instrText>
+              <w:instrText xml:space="preserve"> PAGEREF _Toc226056580 \h </w:instrText>
             </w:r>
             <w:r>
               <w:rPr>
@@ -2292,78 +3009,7 @@
                 <w:noProof/>
                 <w:webHidden/>
               </w:rPr>
-              <w:t>4</w:t>
-            </w:r>
-            <w:r>
-              <w:rPr>
-                <w:noProof/>
-                <w:webHidden/>
-              </w:rPr>
-              <w:fldChar w:fldCharType="end"/>
-            </w:r>
-          </w:hyperlink>
-        </w:p>
-        <w:p>
-          <w:pPr>
-            <w:pStyle w:val="TOC2"/>
-            <w:tabs>
-              <w:tab w:val="right" w:leader="dot" w:pos="9350"/>
-            </w:tabs>
-            <w:rPr>
-              <w:rFonts w:asciiTheme="minorHAnsi" w:eastAsiaTheme="minorEastAsia" w:hAnsiTheme="minorHAnsi" w:cstheme="minorBidi"/>
-              <w:noProof/>
-              <w:color w:val="auto"/>
-              <w:sz w:val="24"/>
-            </w:rPr>
-          </w:pPr>
-          <w:hyperlink w:anchor="_Toc225441086" w:history="1">
-            <w:r>
-              <w:rPr>
-                <w:rStyle w:val="Hyperlink"/>
-                <w:noProof/>
-              </w:rPr>
-              <w:t>Support Needs</w:t>
-            </w:r>
-            <w:r>
-              <w:rPr>
-                <w:noProof/>
-                <w:webHidden/>
-              </w:rPr>
-              <w:tab/>
-            </w:r>
-            <w:r>
-              <w:rPr>
-                <w:noProof/>
-                <w:webHidden/>
-              </w:rPr>
-              <w:fldChar w:fldCharType="begin"/>
-            </w:r>
-            <w:r>
-              <w:rPr>
-                <w:noProof/>
-                <w:webHidden/>
-              </w:rPr>
-              <w:instrText xml:space="preserve"> PAGEREF _Toc225441086 \h </w:instrText>
-            </w:r>
-            <w:r>
-              <w:rPr>
-                <w:noProof/>
-                <w:webHidden/>
-              </w:rPr>
-            </w:r>
-            <w:r>
-              <w:rPr>
-                <w:noProof/>
-                <w:webHidden/>
-              </w:rPr>
-              <w:fldChar w:fldCharType="separate"/>
-            </w:r>
-            <w:r>
-              <w:rPr>
-                <w:noProof/>
-                <w:webHidden/>
-              </w:rPr>
-              <w:t>5</w:t>
+              <w:t>7</w:t>
             </w:r>
             <w:r>
               <w:rPr>
@@ -2401,7 +3047,7 @@
         <w:pStyle w:val="Heading1"/>
         <w:jc w:val="center"/>
       </w:pPr>
-      <w:bookmarkStart w:id="0" w:name="_Toc225441069"/>
+      <w:bookmarkStart w:id="0" w:name="_Toc226056554"/>
       <w:r>
         <w:lastRenderedPageBreak/>
         <w:t>Summary of Work</w:t>
@@ -2412,7 +3058,7 @@
       <w:pPr>
         <w:pStyle w:val="Heading2"/>
       </w:pPr>
-      <w:bookmarkStart w:id="1" w:name="_Toc225441070"/>
+      <w:bookmarkStart w:id="1" w:name="_Toc226056555"/>
       <w:r>
         <w:t>Tasks / Milestones</w:t>
       </w:r>
@@ -2422,9 +3068,11 @@
       <w:pPr>
         <w:pStyle w:val="Heading3"/>
       </w:pPr>
+      <w:bookmarkStart w:id="2" w:name="_Toc226056556"/>
       <w:r>
         <w:t>User Design</w:t>
       </w:r>
+      <w:bookmarkEnd w:id="2"/>
     </w:p>
     <w:p>
       <w:pPr>
@@ -2565,8 +3213,30 @@
           <w:lang w:eastAsia="en-US"/>
         </w:rPr>
         <w:tab/>
-        <w:t>EX: as:A&gt;#R”:Aasdk</w:t>
-      </w:r>
+        <w:t xml:space="preserve">EX: </w:t>
+      </w:r>
+      <w:proofErr w:type="gramStart"/>
+      <w:r>
+        <w:rPr>
+          <w:lang w:eastAsia="en-US"/>
+        </w:rPr>
+        <w:t>as:A</w:t>
+      </w:r>
+      <w:proofErr w:type="gramEnd"/>
+      <w:r>
+        <w:rPr>
+          <w:lang w:eastAsia="en-US"/>
+        </w:rPr>
+        <w:t>&gt;#R</w:t>
+      </w:r>
+      <w:proofErr w:type="gramStart"/>
+      <w:r>
+        <w:rPr>
+          <w:lang w:eastAsia="en-US"/>
+        </w:rPr>
+        <w:t>”:Aasdk</w:t>
+      </w:r>
+      <w:proofErr w:type="gramEnd"/>
     </w:p>
     <w:p>
       <w:pPr>
@@ -2636,9 +3306,11 @@
       <w:pPr>
         <w:pStyle w:val="Heading3"/>
       </w:pPr>
+      <w:bookmarkStart w:id="3" w:name="_Toc226056557"/>
       <w:r>
         <w:t>System design</w:t>
       </w:r>
+      <w:bookmarkEnd w:id="3"/>
     </w:p>
     <w:p>
       <w:pPr>
@@ -2692,7 +3364,15 @@
         <w:t>:</w:t>
       </w:r>
       <w:r>
-        <w:t xml:space="preserve"> will protect users accounts by sending a code to a email or phone after a successful login to stop hackers who have found out the password from entering the account. </w:t>
+        <w:t xml:space="preserve"> will protect users accounts by sending a code to </w:t>
+      </w:r>
+      <w:proofErr w:type="gramStart"/>
+      <w:r>
+        <w:t>a</w:t>
+      </w:r>
+      <w:proofErr w:type="gramEnd"/>
+      <w:r>
+        <w:t xml:space="preserve"> email or phone after a successful login to stop hackers who have found out the password from entering the account. </w:t>
       </w:r>
     </w:p>
     <w:p>
@@ -2745,7 +3425,15 @@
         <w:t xml:space="preserve">Using regex and validation checks </w:t>
       </w:r>
       <w:r>
-        <w:t>to remove white space and illegal characters such as ; or &lt;&gt;. This way no query syntax characters enter the database.</w:t>
+        <w:t xml:space="preserve">to remove white space and illegal characters such </w:t>
+      </w:r>
+      <w:proofErr w:type="gramStart"/>
+      <w:r>
+        <w:t>as ;</w:t>
+      </w:r>
+      <w:proofErr w:type="gramEnd"/>
+      <w:r>
+        <w:t xml:space="preserve"> or &lt;&gt;. This way no query syntax characters enter the database.</w:t>
       </w:r>
     </w:p>
     <w:p>
@@ -2826,6 +3514,86 @@
     </w:p>
     <w:p>
       <w:pPr>
+        <w:pStyle w:val="Heading3"/>
+      </w:pPr>
+      <w:bookmarkStart w:id="4" w:name="_Toc226056558"/>
+      <w:r>
+        <w:t>Basic System design</w:t>
+      </w:r>
+      <w:bookmarkEnd w:id="4"/>
+    </w:p>
+    <w:p>
+      <w:pPr>
+        <w:rPr>
+          <w:lang w:eastAsia="en-US"/>
+        </w:rPr>
+      </w:pPr>
+      <w:r>
+        <w:rPr>
+          <w:lang w:eastAsia="en-US"/>
+        </w:rPr>
+        <w:tab/>
+        <w:t>One of the main system design assumptions made while creating this system is assuming all user input boxes or items are vulnerable and unsafe. As such having both client side and deeper server-side validation for the inputs from the boxes to protect the server and database from outside interference.</w:t>
+      </w:r>
+    </w:p>
+    <w:p>
+      <w:pPr>
+        <w:rPr>
+          <w:lang w:eastAsia="en-US"/>
+        </w:rPr>
+      </w:pPr>
+    </w:p>
+    <w:p>
+      <w:pPr>
+        <w:rPr>
+          <w:lang w:eastAsia="en-US"/>
+        </w:rPr>
+      </w:pPr>
+      <w:r>
+        <w:rPr>
+          <w:lang w:eastAsia="en-US"/>
+        </w:rPr>
+        <w:t>Another main system design is developing a least privilege system. In which users who create accounts are automatically flagged as users in which only have the bare minimum ability to buy and download games.</w:t>
+      </w:r>
+    </w:p>
+    <w:p>
+      <w:pPr>
+        <w:rPr>
+          <w:lang w:eastAsia="en-US"/>
+        </w:rPr>
+      </w:pPr>
+    </w:p>
+    <w:p>
+      <w:pPr>
+        <w:rPr>
+          <w:lang w:eastAsia="en-US"/>
+        </w:rPr>
+      </w:pPr>
+      <w:r>
+        <w:rPr>
+          <w:lang w:eastAsia="en-US"/>
+        </w:rPr>
+        <w:t>Overall,</w:t>
+      </w:r>
+      <w:r>
+        <w:rPr>
+          <w:lang w:eastAsia="en-US"/>
+        </w:rPr>
+        <w:t xml:space="preserve"> this will create a layered defense that will protect our inner database and system from outside attackers that do not need or are allowed to see of interact with these directly.</w:t>
+      </w:r>
+    </w:p>
+    <w:p>
+      <w:pPr>
+        <w:pStyle w:val="Heading2"/>
+      </w:pPr>
+      <w:bookmarkStart w:id="5" w:name="_Toc226056559"/>
+      <w:r>
+        <w:t>Code samples / details</w:t>
+      </w:r>
+      <w:bookmarkEnd w:id="5"/>
+    </w:p>
+    <w:p>
+      <w:pPr>
         <w:pStyle w:val="ListParagraph"/>
         <w:numPr>
           <w:ilvl w:val="0"/>
@@ -2833,607 +3601,1053 @@
         </w:numPr>
       </w:pPr>
       <w:r>
-        <w:t>Basic System design</w:t>
-      </w:r>
+        <w:t>Add screenshots and explanations of code screenshots</w:t>
+      </w:r>
+    </w:p>
+    <w:p>
+      <w:pPr>
+        <w:pStyle w:val="Heading2"/>
+      </w:pPr>
+      <w:bookmarkStart w:id="6" w:name="_Toc226056560"/>
+      <w:r>
+        <w:t>Accomplishments</w:t>
+      </w:r>
+      <w:bookmarkEnd w:id="6"/>
+    </w:p>
+    <w:p>
+      <w:pPr>
+        <w:pStyle w:val="Heading3"/>
+      </w:pPr>
+      <w:bookmarkStart w:id="7" w:name="_Toc226056561"/>
+      <w:r>
+        <w:t>System design</w:t>
+      </w:r>
+      <w:bookmarkEnd w:id="7"/>
+      <w:r>
+        <w:t xml:space="preserve"> </w:t>
+      </w:r>
+    </w:p>
+    <w:p>
+      <w:pPr>
+        <w:rPr>
+          <w:lang w:eastAsia="en-US"/>
+        </w:rPr>
+      </w:pPr>
+      <w:r>
+        <w:rPr>
+          <w:lang w:eastAsia="en-US"/>
+        </w:rPr>
+        <w:t xml:space="preserve">The current system state is partially finished. The rest Api is set up along side the SQL connection. use of procedures within the SQL side to stop users from seeing how </w:t>
+      </w:r>
+      <w:r>
+        <w:rPr>
+          <w:lang w:eastAsia="en-US"/>
+        </w:rPr>
+        <w:t>usernames</w:t>
+      </w:r>
+      <w:r>
+        <w:rPr>
+          <w:lang w:eastAsia="en-US"/>
+        </w:rPr>
+        <w:t xml:space="preserve"> are found by only returning a Boolean to determine if a password and username was matched whilst also logging the login attempt on the account. </w:t>
+      </w:r>
+      <w:r>
+        <w:rPr>
+          <w:lang w:eastAsia="en-US"/>
+        </w:rPr>
+        <w:t>These procedures will read the login list history to determine if its suspicious by returning a Boolean to let the server know if the login attempts should be blocked. A basic JavaScript/HTML</w:t>
+      </w:r>
+      <w:r>
+        <w:rPr>
+          <w:lang w:eastAsia="en-US"/>
+        </w:rPr>
+        <w:t xml:space="preserve"> front end that allows login testing and basic validation. This allows us to gather a basic use case of the program:</w:t>
+      </w:r>
+    </w:p>
+    <w:p>
+      <w:pPr>
+        <w:rPr>
+          <w:lang w:eastAsia="en-US"/>
+        </w:rPr>
+      </w:pPr>
+      <w:r>
+        <w:rPr>
+          <w:lang w:eastAsia="en-US"/>
+        </w:rPr>
+        <w:tab/>
+      </w:r>
+      <w:r>
+        <w:rPr>
+          <w:lang w:eastAsia="en-US"/>
+        </w:rPr>
+        <w:tab/>
+        <w:t>Creating an account</w:t>
+      </w:r>
+    </w:p>
+    <w:p>
+      <w:pPr>
+        <w:rPr>
+          <w:lang w:eastAsia="en-US"/>
+        </w:rPr>
+      </w:pPr>
+      <w:r>
+        <w:rPr>
+          <w:lang w:eastAsia="en-US"/>
+        </w:rPr>
+        <w:tab/>
+      </w:r>
+      <w:r>
+        <w:rPr>
+          <w:lang w:eastAsia="en-US"/>
+        </w:rPr>
+        <w:tab/>
+        <w:t>Login to an account</w:t>
+      </w:r>
+    </w:p>
+    <w:p>
+      <w:pPr>
+        <w:rPr>
+          <w:lang w:eastAsia="en-US"/>
+        </w:rPr>
+      </w:pPr>
+      <w:r>
+        <w:rPr>
+          <w:lang w:eastAsia="en-US"/>
+        </w:rPr>
+        <w:tab/>
+      </w:r>
+      <w:r>
+        <w:rPr>
+          <w:lang w:eastAsia="en-US"/>
+        </w:rPr>
+        <w:tab/>
+        <w:t>Buying a game</w:t>
+      </w:r>
+    </w:p>
+    <w:p>
+      <w:pPr>
+        <w:rPr>
+          <w:lang w:eastAsia="en-US"/>
+        </w:rPr>
+      </w:pPr>
+      <w:r>
+        <w:rPr>
+          <w:lang w:eastAsia="en-US"/>
+        </w:rPr>
+        <w:tab/>
+      </w:r>
+      <w:r>
+        <w:rPr>
+          <w:lang w:eastAsia="en-US"/>
+        </w:rPr>
+        <w:tab/>
+        <w:t>“Download a game”</w:t>
+      </w:r>
+    </w:p>
+    <w:p>
+      <w:pPr>
+        <w:rPr>
+          <w:lang w:eastAsia="en-US"/>
+        </w:rPr>
+      </w:pPr>
+      <w:r>
+        <w:rPr>
+          <w:lang w:eastAsia="en-US"/>
+        </w:rPr>
+        <w:t xml:space="preserve"> A keynote about the download game functionality is that we won’t be implementing it as we don’t have data saved on a database like fully functional games. As such we are going to create a text file that simply is called the game in which the user downloads to mimic the user downloading the game onto their computer without forcing scope creep into this assignment.</w:t>
+      </w:r>
+    </w:p>
+    <w:p>
+      <w:pPr>
+        <w:pStyle w:val="Heading1"/>
+        <w:jc w:val="center"/>
+      </w:pPr>
+      <w:bookmarkStart w:id="8" w:name="_Toc226056562"/>
+      <w:r>
+        <w:lastRenderedPageBreak/>
+        <w:t>Work In Progress</w:t>
+      </w:r>
+      <w:bookmarkEnd w:id="8"/>
+    </w:p>
+    <w:p>
+      <w:pPr>
+        <w:pStyle w:val="Heading2"/>
+      </w:pPr>
+      <w:bookmarkStart w:id="9" w:name="_Toc226056563"/>
+      <w:r>
+        <w:t>C</w:t>
+      </w:r>
+      <w:r>
+        <w:t>urrent Tasks</w:t>
+      </w:r>
+      <w:bookmarkEnd w:id="9"/>
+    </w:p>
+    <w:p>
+      <w:pPr>
+        <w:pStyle w:val="Heading3"/>
+      </w:pPr>
+      <w:bookmarkStart w:id="10" w:name="_Toc226056564"/>
+      <w:r>
+        <w:t>Which parts of the system is being done.</w:t>
+      </w:r>
+      <w:bookmarkEnd w:id="10"/>
+      <w:r>
+        <w:t xml:space="preserve"> </w:t>
+      </w:r>
+    </w:p>
+    <w:p>
+      <w:pPr>
+        <w:rPr>
+          <w:lang w:eastAsia="en-US"/>
+        </w:rPr>
+      </w:pPr>
+      <w:r>
+        <w:rPr>
+          <w:lang w:eastAsia="en-US"/>
+        </w:rPr>
+        <w:t>The current work is being done on the front end to make it more user friendly and add further user validation and create a secure front end finish the front end. This will allow us to determine what the serve side functionality should do and finalize what the back end will contain.</w:t>
+      </w:r>
+      <w:r>
+        <w:rPr>
+          <w:lang w:eastAsia="en-US"/>
+        </w:rPr>
+        <w:t xml:space="preserve"> This will also bring up the use of further procedures or tables within the SQL database should they be needed making </w:t>
+      </w:r>
+      <w:proofErr w:type="gramStart"/>
+      <w:r>
+        <w:rPr>
+          <w:lang w:eastAsia="en-US"/>
+        </w:rPr>
+        <w:t>it</w:t>
+      </w:r>
+      <w:proofErr w:type="gramEnd"/>
+      <w:r>
+        <w:rPr>
+          <w:lang w:eastAsia="en-US"/>
+        </w:rPr>
+        <w:t xml:space="preserve"> so we don’t have to return to the SQL multiple times to see if certain tables are needed to be updated or not.</w:t>
+      </w:r>
+    </w:p>
+    <w:p>
+      <w:pPr>
+        <w:pStyle w:val="Heading3"/>
+      </w:pPr>
+      <w:bookmarkStart w:id="11" w:name="_Toc226056565"/>
+      <w:r>
+        <w:t>Who’s doing what</w:t>
+      </w:r>
+      <w:bookmarkEnd w:id="11"/>
+    </w:p>
+    <w:p>
+      <w:pPr>
+        <w:rPr>
+          <w:lang w:eastAsia="en-US"/>
+        </w:rPr>
+      </w:pPr>
+      <w:r>
+        <w:rPr>
+          <w:lang w:eastAsia="en-US"/>
+        </w:rPr>
+        <w:t>Currently each group member takes a functionality from the front-end system and begins updating it from the older basic model. For example, working on the login page or create user page would be two items that group members would do. As the login types and creation of accounts are simple, we have left this to a single group member to allow for the other two members to get a head start on the C# server Api and the game purchase or library pages. Once the first group member is done with the login pages, they will then assist the other two members in creating and testing the future tasks that need to be finished on the system</w:t>
+      </w:r>
+    </w:p>
+    <w:p>
+      <w:pPr>
+        <w:rPr>
+          <w:lang w:eastAsia="en-US"/>
+        </w:rPr>
+      </w:pPr>
+      <w:r>
+        <w:rPr>
+          <w:lang w:eastAsia="en-US"/>
+        </w:rPr>
+        <w:tab/>
+      </w:r>
+      <w:r>
+        <w:rPr>
+          <w:lang w:eastAsia="en-US"/>
+        </w:rPr>
+        <w:tab/>
+        <w:t>Login/create account pages: Zemmat Hagos</w:t>
+      </w:r>
+    </w:p>
+    <w:p>
+      <w:pPr>
+        <w:rPr>
+          <w:lang w:eastAsia="en-US"/>
+        </w:rPr>
+      </w:pPr>
+      <w:r>
+        <w:rPr>
+          <w:lang w:eastAsia="en-US"/>
+        </w:rPr>
+        <w:tab/>
+      </w:r>
+      <w:r>
+        <w:rPr>
+          <w:lang w:eastAsia="en-US"/>
+        </w:rPr>
+        <w:tab/>
+        <w:t>Front End Library pages: Will Jessel</w:t>
+      </w:r>
+    </w:p>
+    <w:p>
+      <w:pPr>
+        <w:rPr>
+          <w:lang w:eastAsia="en-US"/>
+        </w:rPr>
+      </w:pPr>
+      <w:r>
+        <w:rPr>
+          <w:lang w:eastAsia="en-US"/>
+        </w:rPr>
+        <w:tab/>
+      </w:r>
+      <w:r>
+        <w:rPr>
+          <w:lang w:eastAsia="en-US"/>
+        </w:rPr>
+        <w:tab/>
+      </w:r>
+      <w:r>
+        <w:rPr>
+          <w:lang w:eastAsia="en-US"/>
+        </w:rPr>
+        <w:t>Back-end</w:t>
+      </w:r>
+      <w:r>
+        <w:rPr>
+          <w:lang w:eastAsia="en-US"/>
+        </w:rPr>
+        <w:t xml:space="preserve"> Api and SQL database: Eric Moutoux</w:t>
+      </w:r>
+    </w:p>
+    <w:p>
+      <w:pPr>
+        <w:pStyle w:val="Heading3"/>
+      </w:pPr>
+      <w:bookmarkStart w:id="12" w:name="_Toc226056566"/>
+      <w:r>
+        <w:t>Timeline</w:t>
+      </w:r>
+      <w:bookmarkEnd w:id="12"/>
+    </w:p>
+    <w:p>
+      <w:pPr>
+        <w:rPr>
+          <w:lang w:eastAsia="en-US"/>
+        </w:rPr>
+      </w:pPr>
+      <w:r>
+        <w:rPr>
+          <w:lang w:eastAsia="en-US"/>
+        </w:rPr>
+        <w:t xml:space="preserve">The front-end login accounts pages should take no more than a day or two as such should be done within the end of the weekend. As the other two tasks will take a slightly longer amount of time which will also include future testing and code review this will likely take the rest of the following week. However, once the tasks are complete testing tasks will take up the remaining time until the assignment is due </w:t>
+      </w:r>
+      <w:r>
+        <w:rPr>
+          <w:lang w:eastAsia="en-US"/>
+        </w:rPr>
+        <w:t>to</w:t>
+      </w:r>
+      <w:r>
+        <w:rPr>
+          <w:lang w:eastAsia="en-US"/>
+        </w:rPr>
+        <w:t xml:space="preserve"> create a safe and protected system that can protect users and systems alike.</w:t>
+      </w:r>
+    </w:p>
+    <w:p>
+      <w:pPr>
+        <w:pStyle w:val="Heading3"/>
+      </w:pPr>
+      <w:bookmarkStart w:id="13" w:name="_Toc226056567"/>
+      <w:r>
+        <w:t>Start date</w:t>
+      </w:r>
+      <w:bookmarkEnd w:id="13"/>
+    </w:p>
+    <w:p>
+      <w:pPr>
+        <w:rPr>
+          <w:lang w:eastAsia="en-US"/>
+        </w:rPr>
+      </w:pPr>
+      <w:r>
+        <w:rPr>
+          <w:lang w:eastAsia="en-US"/>
+        </w:rPr>
+        <w:t>The start date of the assignment was when the design and implementation was sketched out and building the basic layout following took around a week. Including basic tests. The Current set of creations began in the tail end of march and will finish around April 8</w:t>
+      </w:r>
+      <w:r>
+        <w:rPr>
+          <w:vertAlign w:val="superscript"/>
+          <w:lang w:eastAsia="en-US"/>
+        </w:rPr>
+        <w:t>th</w:t>
+      </w:r>
+      <w:r>
+        <w:rPr>
+          <w:lang w:eastAsia="en-US"/>
+        </w:rPr>
+        <w:t xml:space="preserve">. </w:t>
+      </w:r>
+    </w:p>
+    <w:p>
+      <w:pPr>
+        <w:pStyle w:val="Heading2"/>
+      </w:pPr>
+      <w:bookmarkStart w:id="14" w:name="_Toc226056568"/>
+      <w:r>
+        <w:t>Current Testing sections</w:t>
+      </w:r>
+      <w:bookmarkEnd w:id="14"/>
+    </w:p>
+    <w:p>
+      <w:pPr>
+        <w:pStyle w:val="Heading3"/>
+      </w:pPr>
+      <w:bookmarkStart w:id="15" w:name="_Toc226056569"/>
+      <w:r>
+        <w:t>Which parts of the system is being tested.</w:t>
+      </w:r>
+      <w:bookmarkEnd w:id="15"/>
+    </w:p>
+    <w:p>
+      <w:pPr>
+        <w:rPr>
+          <w:lang w:eastAsia="en-US"/>
+        </w:rPr>
+      </w:pPr>
+      <w:r>
+        <w:rPr>
+          <w:lang w:eastAsia="en-US"/>
+        </w:rPr>
+        <w:t xml:space="preserve">The current system being tested is the basic system as each change is made no matter how small. Once each change is made a </w:t>
+      </w:r>
+      <w:r>
+        <w:rPr>
+          <w:lang w:eastAsia="en-US"/>
+        </w:rPr>
+        <w:t xml:space="preserve">single tester or multiple testers depending on the test will run the code and attempt to </w:t>
+      </w:r>
+      <w:r>
+        <w:rPr>
+          <w:lang w:eastAsia="en-US"/>
+        </w:rPr>
+        <w:t>investigate</w:t>
+      </w:r>
+      <w:r>
+        <w:rPr>
+          <w:lang w:eastAsia="en-US"/>
+        </w:rPr>
+        <w:t xml:space="preserve"> it to see if it introduces security vulnerabilities. This testing includes the SQL </w:t>
+      </w:r>
+      <w:r>
+        <w:rPr>
+          <w:lang w:eastAsia="en-US"/>
+        </w:rPr>
+        <w:lastRenderedPageBreak/>
+        <w:t xml:space="preserve">tables and procedures. Account creation and login pages. As further tests on the main pages and </w:t>
+      </w:r>
+      <w:r>
+        <w:rPr>
+          <w:lang w:eastAsia="en-US"/>
+        </w:rPr>
+        <w:t>Api</w:t>
+      </w:r>
+      <w:r>
+        <w:rPr>
+          <w:lang w:eastAsia="en-US"/>
+        </w:rPr>
+        <w:t xml:space="preserve"> items will take place once the </w:t>
+      </w:r>
+      <w:r>
+        <w:rPr>
+          <w:lang w:eastAsia="en-US"/>
+        </w:rPr>
+        <w:t>SQL</w:t>
+      </w:r>
+      <w:r>
+        <w:rPr>
+          <w:lang w:eastAsia="en-US"/>
+        </w:rPr>
+        <w:t xml:space="preserve"> tables and the account pages are complete</w:t>
+      </w:r>
+      <w:r>
+        <w:rPr>
+          <w:lang w:eastAsia="en-US"/>
+        </w:rPr>
+        <w:t>.</w:t>
+      </w:r>
+    </w:p>
+    <w:p>
+      <w:pPr>
+        <w:pStyle w:val="Heading3"/>
+      </w:pPr>
+      <w:bookmarkStart w:id="16" w:name="_Toc226056570"/>
+      <w:r>
+        <w:t>Who’s doing it</w:t>
+      </w:r>
+      <w:bookmarkEnd w:id="16"/>
+    </w:p>
+    <w:p>
+      <w:pPr>
+        <w:rPr>
+          <w:lang w:eastAsia="en-US"/>
+        </w:rPr>
+      </w:pPr>
+      <w:r>
+        <w:rPr>
+          <w:lang w:eastAsia="en-US"/>
+        </w:rPr>
+        <w:t xml:space="preserve">Testing is a group effort and is not solely laid </w:t>
+      </w:r>
+      <w:r>
+        <w:rPr>
+          <w:lang w:eastAsia="en-US"/>
+        </w:rPr>
+        <w:t>upon</w:t>
+      </w:r>
+      <w:r>
+        <w:rPr>
+          <w:lang w:eastAsia="en-US"/>
+        </w:rPr>
+        <w:t xml:space="preserve"> anyone as having multiple </w:t>
+      </w:r>
+      <w:r>
+        <w:rPr>
+          <w:lang w:eastAsia="en-US"/>
+        </w:rPr>
+        <w:t>viewpoints</w:t>
+      </w:r>
+      <w:r>
+        <w:rPr>
+          <w:lang w:eastAsia="en-US"/>
+        </w:rPr>
+        <w:t xml:space="preserve"> on each error or security vulnerability that appears allows multiple solutions and a better solution to be created rather than a solution that simply fixes a bug.</w:t>
+      </w:r>
+      <w:r>
+        <w:rPr>
+          <w:lang w:eastAsia="en-US"/>
+        </w:rPr>
+        <w:t xml:space="preserve"> As knowing what a hacker or user would be impossible having each member give their input and the programmer who created the bug implement the fix allows for learning as a time and sharing of thought processes that could improve </w:t>
+      </w:r>
+      <w:r>
+        <w:rPr>
+          <w:lang w:eastAsia="en-US"/>
+        </w:rPr>
+        <w:t>everyone’s</w:t>
+      </w:r>
+      <w:r>
+        <w:rPr>
+          <w:lang w:eastAsia="en-US"/>
+        </w:rPr>
+        <w:t xml:space="preserve"> abilities as the system develops.</w:t>
+      </w:r>
+    </w:p>
+    <w:p>
+      <w:pPr>
+        <w:pStyle w:val="Heading1"/>
+        <w:jc w:val="center"/>
+      </w:pPr>
+      <w:bookmarkStart w:id="17" w:name="_Toc226056571"/>
+      <w:r>
+        <w:t>Next Steps</w:t>
+      </w:r>
+      <w:bookmarkEnd w:id="17"/>
+    </w:p>
+    <w:p>
+      <w:pPr>
+        <w:pStyle w:val="Heading2"/>
+      </w:pPr>
+      <w:bookmarkStart w:id="18" w:name="_Toc226056572"/>
+      <w:r>
+        <w:t>Upcoming Features</w:t>
+      </w:r>
+      <w:bookmarkEnd w:id="18"/>
+    </w:p>
+    <w:p>
+      <w:pPr>
+        <w:rPr>
+          <w:lang w:eastAsia="en-US"/>
+        </w:rPr>
+      </w:pPr>
+      <w:r>
+        <w:rPr>
+          <w:lang w:eastAsia="en-US"/>
+        </w:rPr>
+        <w:tab/>
+      </w:r>
+      <w:r>
+        <w:rPr>
+          <w:lang w:eastAsia="en-US"/>
+        </w:rPr>
+        <w:tab/>
+        <w:t xml:space="preserve">Next features we are planning to include into this program or </w:t>
+      </w:r>
+      <w:r>
+        <w:rPr>
+          <w:lang w:eastAsia="en-US"/>
+        </w:rPr>
+        <w:t>future</w:t>
+      </w:r>
+      <w:r>
+        <w:rPr>
+          <w:lang w:eastAsia="en-US"/>
+        </w:rPr>
+        <w:t xml:space="preserve"> for this program outside of this assignments scope would be adding a forget password to the login screen that emails you a reset password link. </w:t>
+      </w:r>
+    </w:p>
+    <w:p>
+      <w:pPr>
+        <w:rPr>
+          <w:lang w:eastAsia="en-US"/>
+        </w:rPr>
+      </w:pPr>
+      <w:r>
+        <w:rPr>
+          <w:lang w:eastAsia="en-US"/>
+        </w:rPr>
+        <w:tab/>
+      </w:r>
+    </w:p>
+    <w:p>
+      <w:pPr>
+        <w:rPr>
+          <w:lang w:eastAsia="en-US"/>
+        </w:rPr>
+      </w:pPr>
+      <w:r>
+        <w:rPr>
+          <w:lang w:eastAsia="en-US"/>
+        </w:rPr>
+        <w:tab/>
+      </w:r>
+      <w:r>
+        <w:rPr>
+          <w:lang w:eastAsia="en-US"/>
+        </w:rPr>
+        <w:tab/>
+        <w:t xml:space="preserve">Adding more visual </w:t>
+      </w:r>
+      <w:r>
+        <w:rPr>
+          <w:lang w:eastAsia="en-US"/>
+        </w:rPr>
+        <w:t>images</w:t>
+      </w:r>
+      <w:r>
+        <w:rPr>
+          <w:lang w:eastAsia="en-US"/>
+        </w:rPr>
+        <w:t xml:space="preserve"> to the game library. Like adding game art </w:t>
+      </w:r>
+      <w:r>
+        <w:rPr>
+          <w:lang w:eastAsia="en-US"/>
+        </w:rPr>
+        <w:t>images</w:t>
+      </w:r>
+      <w:r>
+        <w:rPr>
+          <w:lang w:eastAsia="en-US"/>
+        </w:rPr>
+        <w:t xml:space="preserve"> and other such items</w:t>
+      </w:r>
+      <w:r>
+        <w:rPr>
+          <w:lang w:eastAsia="en-US"/>
+        </w:rPr>
+        <w:t xml:space="preserve">. This could also include reviews, game </w:t>
+      </w:r>
+      <w:r>
+        <w:rPr>
+          <w:lang w:eastAsia="en-US"/>
+        </w:rPr>
+        <w:t>summaries</w:t>
+      </w:r>
+      <w:r>
+        <w:rPr>
+          <w:lang w:eastAsia="en-US"/>
+        </w:rPr>
+        <w:t xml:space="preserve"> and other user benefiting features. </w:t>
+      </w:r>
+      <w:r>
+        <w:rPr>
+          <w:lang w:eastAsia="en-US"/>
+        </w:rPr>
+        <w:t>Finally,</w:t>
+      </w:r>
+      <w:r>
+        <w:rPr>
+          <w:lang w:eastAsia="en-US"/>
+        </w:rPr>
+        <w:t xml:space="preserve"> we could add more options for interacting with games like the company’s </w:t>
+      </w:r>
+      <w:r>
+        <w:rPr>
+          <w:lang w:eastAsia="en-US"/>
+        </w:rPr>
+        <w:t>who</w:t>
+      </w:r>
+      <w:r>
+        <w:rPr>
+          <w:lang w:eastAsia="en-US"/>
+        </w:rPr>
+        <w:t xml:space="preserve"> created them and other such details that things like steam have.</w:t>
+      </w:r>
+    </w:p>
+    <w:p>
+      <w:pPr>
+        <w:rPr>
+          <w:lang w:eastAsia="en-US"/>
+        </w:rPr>
+      </w:pPr>
+    </w:p>
+    <w:p>
+      <w:pPr>
+        <w:rPr>
+          <w:lang w:eastAsia="en-US"/>
+        </w:rPr>
+      </w:pPr>
+      <w:r>
+        <w:rPr>
+          <w:lang w:eastAsia="en-US"/>
+        </w:rPr>
+        <w:tab/>
+      </w:r>
+      <w:r>
+        <w:rPr>
+          <w:lang w:eastAsia="en-US"/>
+        </w:rPr>
+        <w:tab/>
+        <w:t>All future steps within the scope of the project can be found within the above sections including updating the user interface, improving the SQL database structure and defense. Improving data validation and adding further details and Ui abilities to the store and library pages.</w:t>
+      </w:r>
+    </w:p>
+    <w:p>
+      <w:pPr>
+        <w:pStyle w:val="Heading1"/>
+        <w:jc w:val="center"/>
+      </w:pPr>
+      <w:bookmarkStart w:id="19" w:name="_Toc226056573"/>
+      <w:r>
+        <w:t>Issues, Risks, or Challenges</w:t>
+      </w:r>
+      <w:bookmarkEnd w:id="19"/>
+    </w:p>
+    <w:p>
+      <w:pPr>
+        <w:pStyle w:val="Heading2"/>
+      </w:pPr>
+      <w:bookmarkStart w:id="20" w:name="_Toc226056574"/>
+      <w:r>
+        <w:t>Roadblocks</w:t>
+      </w:r>
+      <w:bookmarkEnd w:id="20"/>
+    </w:p>
+    <w:p>
+      <w:pPr>
+        <w:pStyle w:val="Heading3"/>
+      </w:pPr>
+      <w:bookmarkStart w:id="21" w:name="_Toc226056575"/>
+      <w:r>
+        <w:t>Programmatic Delays</w:t>
+      </w:r>
+      <w:bookmarkEnd w:id="21"/>
+    </w:p>
+    <w:p>
+      <w:pPr>
+        <w:rPr>
+          <w:lang w:eastAsia="en-US"/>
+        </w:rPr>
+      </w:pPr>
+      <w:r>
+        <w:rPr>
+          <w:lang w:eastAsia="en-US"/>
+        </w:rPr>
+        <w:tab/>
+      </w:r>
+      <w:r>
+        <w:rPr>
+          <w:lang w:eastAsia="en-US"/>
+        </w:rPr>
+        <w:tab/>
+        <w:t xml:space="preserve">Relearning how to create rest Api’s once again after being away from them for so long lead to some growing pains as we reimbursed ourselves in connecting </w:t>
+      </w:r>
+      <w:proofErr w:type="gramStart"/>
+      <w:r>
+        <w:rPr>
+          <w:lang w:eastAsia="en-US"/>
+        </w:rPr>
+        <w:t>a</w:t>
+      </w:r>
+      <w:proofErr w:type="gramEnd"/>
+      <w:r>
+        <w:rPr>
+          <w:lang w:eastAsia="en-US"/>
+        </w:rPr>
+        <w:t xml:space="preserve"> Api to an SQL server. The syntax for [HTTP] requests specifically gave us a small challenge as they aren’t as easily picked up on compared to the rest of the c# coding language. </w:t>
+      </w:r>
+    </w:p>
+    <w:p>
+      <w:pPr>
+        <w:rPr>
+          <w:lang w:eastAsia="en-US"/>
+        </w:rPr>
+      </w:pPr>
+    </w:p>
+    <w:p>
+      <w:pPr>
+        <w:rPr>
+          <w:lang w:eastAsia="en-US"/>
+        </w:rPr>
+      </w:pPr>
+      <w:r>
+        <w:rPr>
+          <w:lang w:eastAsia="en-US"/>
+        </w:rPr>
+        <w:tab/>
+      </w:r>
+      <w:r>
+        <w:rPr>
+          <w:lang w:eastAsia="en-US"/>
+        </w:rPr>
+        <w:tab/>
+        <w:t xml:space="preserve">Small syntax mistakes also where challenging as JavaScript and [HTTP] requests tends to be a bit harder to visually check out while looking at it. Connecting to the SQL database is rather quite easy now with our give advanced SQL course allowing this to come up easy however using it within a rest Api </w:t>
+      </w:r>
+      <w:r>
+        <w:rPr>
+          <w:lang w:eastAsia="en-US"/>
+        </w:rPr>
+        <w:lastRenderedPageBreak/>
+        <w:t>needed us to follow a tutorial to explain how exactly to use a SQL database in the right manner within our systems design.</w:t>
+      </w:r>
+    </w:p>
+    <w:p>
+      <w:pPr>
+        <w:ind w:left="0"/>
+      </w:pPr>
+    </w:p>
+    <w:p>
+      <w:pPr>
+        <w:ind w:left="0"/>
+      </w:pPr>
+      <w:r>
+        <w:tab/>
+      </w:r>
+      <w:r>
+        <w:tab/>
+        <w:t xml:space="preserve">There </w:t>
+      </w:r>
+      <w:r>
+        <w:t>were</w:t>
+      </w:r>
+      <w:r>
+        <w:t xml:space="preserve"> a few times where foreign keys and table item creations were a tad bit buggy but overall worked quiet well as such not many run time errors were encountered</w:t>
+      </w:r>
+    </w:p>
+    <w:p>
+      <w:pPr>
+        <w:ind w:left="0"/>
+      </w:pPr>
+    </w:p>
+    <w:p>
+      <w:pPr>
+        <w:ind w:left="0"/>
+      </w:pPr>
+      <w:r>
+        <w:tab/>
+      </w:r>
+      <w:r>
+        <w:tab/>
+        <w:t>There have yet to be any major logical flow errors and design errors within our program as such have yet to truly hold us back from completing the first objective. However, I Forsee the next steps involving more of those logical flow errors and internal programmatic errors.</w:t>
+      </w:r>
+    </w:p>
+    <w:p>
+      <w:pPr>
+        <w:pStyle w:val="Heading3"/>
+      </w:pPr>
+      <w:bookmarkStart w:id="22" w:name="_Toc226056576"/>
+      <w:r>
+        <w:t>Non-Programmatic Delays</w:t>
+      </w:r>
+      <w:bookmarkEnd w:id="22"/>
+    </w:p>
+    <w:p>
+      <w:pPr>
+        <w:ind w:firstLine="350"/>
+        <w:rPr>
+          <w:lang w:eastAsia="en-US"/>
+        </w:rPr>
+      </w:pPr>
+      <w:r>
+        <w:rPr>
+          <w:lang w:eastAsia="en-US"/>
+        </w:rPr>
+        <w:t>While the Ui is very basic now the underlying flow and feel of the system is somewhat what we are hoping for. While this may change as we expand the library section and store front currently as the program stands the logical flow and its non programmatic issues aren’t a front facing issue</w:t>
+      </w:r>
+    </w:p>
+    <w:p>
+      <w:pPr>
+        <w:pStyle w:val="Heading2"/>
+      </w:pPr>
+      <w:bookmarkStart w:id="23" w:name="_Toc226056577"/>
+      <w:r>
+        <w:t>Dependencies</w:t>
+      </w:r>
+      <w:bookmarkEnd w:id="23"/>
+    </w:p>
+    <w:p>
+      <w:pPr>
+        <w:pStyle w:val="Heading3"/>
+      </w:pPr>
+      <w:bookmarkStart w:id="24" w:name="_Toc226056578"/>
+      <w:r>
+        <w:t>External libraries</w:t>
+      </w:r>
+      <w:bookmarkEnd w:id="24"/>
+    </w:p>
+    <w:p>
+      <w:pPr>
+        <w:rPr>
+          <w:lang w:eastAsia="en-US"/>
+        </w:rPr>
+      </w:pPr>
+      <w:r>
+        <w:rPr>
+          <w:lang w:eastAsia="en-US"/>
+        </w:rPr>
+        <w:t>One of the main external libraries are apart of the hashing process as must other functionality are supported natively within C# and JavaScript libraries.</w:t>
+      </w:r>
+    </w:p>
+    <w:p>
+      <w:pPr>
+        <w:pStyle w:val="Heading3"/>
+      </w:pPr>
+      <w:bookmarkStart w:id="25" w:name="_Toc226056579"/>
+      <w:r>
+        <w:t>Programming languages</w:t>
+      </w:r>
+      <w:bookmarkEnd w:id="25"/>
     </w:p>
     <w:p>
       <w:pPr>
         <w:pStyle w:val="ListParagraph"/>
         <w:numPr>
           <w:ilvl w:val="0"/>
-          <w:numId w:val="3"/>
+          <w:numId w:val="14"/>
         </w:numPr>
       </w:pPr>
       <w:r>
-        <w:t>Report</w:t>
-      </w:r>
-    </w:p>
-    <w:p>
-      <w:pPr>
-        <w:pStyle w:val="Heading2"/>
-      </w:pPr>
-      <w:bookmarkStart w:id="2" w:name="_Toc225441071"/>
-      <w:r>
-        <w:t>Code samples / details</w:t>
-      </w:r>
-      <w:bookmarkEnd w:id="2"/>
+        <w:t>C# as the server side of our rest Api.</w:t>
+      </w:r>
     </w:p>
     <w:p>
       <w:pPr>
         <w:pStyle w:val="ListParagraph"/>
         <w:numPr>
           <w:ilvl w:val="0"/>
-          <w:numId w:val="3"/>
+          <w:numId w:val="14"/>
         </w:numPr>
       </w:pPr>
       <w:r>
-        <w:t>Add screenshots and explanations of code screenshots</w:t>
-      </w:r>
-    </w:p>
-    <w:p>
-      <w:pPr>
-        <w:pStyle w:val="Heading2"/>
-      </w:pPr>
-      <w:bookmarkStart w:id="3" w:name="_Toc225441072"/>
-      <w:r>
-        <w:t>Accomplishments</w:t>
-      </w:r>
-      <w:bookmarkEnd w:id="3"/>
+        <w:t>JavaScript for the front end of the website that the user interacts with</w:t>
+      </w:r>
     </w:p>
     <w:p>
       <w:pPr>
         <w:pStyle w:val="ListParagraph"/>
         <w:numPr>
           <w:ilvl w:val="0"/>
-          <w:numId w:val="2"/>
+          <w:numId w:val="14"/>
         </w:numPr>
       </w:pPr>
       <w:r>
-        <w:t>System design</w:t>
-      </w:r>
-      <w:r>
-        <w:t xml:space="preserve"> </w:t>
-      </w:r>
-    </w:p>
-    <w:p>
-      <w:pPr>
-        <w:pStyle w:val="ListParagraph"/>
-        <w:numPr>
-          <w:ilvl w:val="0"/>
-          <w:numId w:val="2"/>
-        </w:numPr>
-      </w:pPr>
-      <w:r>
-        <w:t>Basic System design</w:t>
-      </w:r>
-      <w:r>
-        <w:t xml:space="preserve"> / further system design</w:t>
-      </w:r>
-    </w:p>
-    <w:p>
-      <w:pPr>
-        <w:pStyle w:val="Heading1"/>
-        <w:jc w:val="center"/>
-      </w:pPr>
-      <w:bookmarkStart w:id="4" w:name="_Toc225441073"/>
-      <w:r>
-        <w:t>Work In Progress</w:t>
-      </w:r>
-      <w:bookmarkEnd w:id="4"/>
-    </w:p>
-    <w:p>
-      <w:pPr>
-        <w:pStyle w:val="Heading2"/>
-      </w:pPr>
-      <w:bookmarkStart w:id="5" w:name="_Toc225441074"/>
-      <w:r>
-        <w:t>C</w:t>
-      </w:r>
-      <w:r>
-        <w:t>urrent Tasks</w:t>
-      </w:r>
-      <w:bookmarkEnd w:id="5"/>
-    </w:p>
-    <w:p>
-      <w:pPr>
-        <w:pStyle w:val="ListParagraph"/>
-        <w:numPr>
-          <w:ilvl w:val="0"/>
-          <w:numId w:val="4"/>
-        </w:numPr>
-      </w:pPr>
-      <w:r>
-        <w:t xml:space="preserve">Which parts of the system is being done. </w:t>
-      </w:r>
-    </w:p>
-    <w:p>
-      <w:pPr>
-        <w:pStyle w:val="ListParagraph"/>
-        <w:numPr>
-          <w:ilvl w:val="0"/>
-          <w:numId w:val="4"/>
-        </w:numPr>
-      </w:pPr>
-      <w:r>
-        <w:t>Who’s doing what</w:t>
-      </w:r>
-    </w:p>
-    <w:p>
-      <w:pPr>
-        <w:pStyle w:val="ListParagraph"/>
-        <w:numPr>
-          <w:ilvl w:val="0"/>
-          <w:numId w:val="4"/>
-        </w:numPr>
-      </w:pPr>
-      <w:r>
-        <w:t>Timeline</w:t>
-      </w:r>
-    </w:p>
-    <w:p>
-      <w:pPr>
-        <w:pStyle w:val="ListParagraph"/>
-        <w:numPr>
-          <w:ilvl w:val="0"/>
-          <w:numId w:val="4"/>
-        </w:numPr>
-      </w:pPr>
-      <w:r>
-        <w:t>Start date</w:t>
-      </w:r>
-    </w:p>
-    <w:p>
-      <w:pPr>
-        <w:pStyle w:val="Heading2"/>
-      </w:pPr>
-      <w:bookmarkStart w:id="6" w:name="_Toc225441075"/>
-      <w:r>
-        <w:t>Current Testing sections</w:t>
-      </w:r>
-      <w:bookmarkEnd w:id="6"/>
-    </w:p>
-    <w:p>
-      <w:pPr>
-        <w:pStyle w:val="ListParagraph"/>
-        <w:numPr>
-          <w:ilvl w:val="0"/>
-          <w:numId w:val="5"/>
-        </w:numPr>
-      </w:pPr>
-      <w:r>
-        <w:t>Which parts of the system is being tested.</w:t>
-      </w:r>
-    </w:p>
-    <w:p>
-      <w:pPr>
-        <w:pStyle w:val="ListParagraph"/>
-        <w:numPr>
-          <w:ilvl w:val="0"/>
-          <w:numId w:val="5"/>
-        </w:numPr>
-      </w:pPr>
-      <w:r>
-        <w:t>Who’s doing it</w:t>
-      </w:r>
-    </w:p>
-    <w:p>
-      <w:pPr>
-        <w:pStyle w:val="ListParagraph"/>
-        <w:numPr>
-          <w:ilvl w:val="0"/>
-          <w:numId w:val="5"/>
-        </w:numPr>
-      </w:pPr>
-      <w:r>
-        <w:t>Timeline</w:t>
-      </w:r>
-    </w:p>
-    <w:p>
-      <w:pPr>
-        <w:pStyle w:val="ListParagraph"/>
-        <w:numPr>
-          <w:ilvl w:val="0"/>
-          <w:numId w:val="5"/>
-        </w:numPr>
-      </w:pPr>
-      <w:r>
-        <w:t>Start date</w:t>
-      </w:r>
-    </w:p>
-    <w:p>
-      <w:pPr>
-        <w:pStyle w:val="Heading2"/>
-      </w:pPr>
-      <w:bookmarkStart w:id="7" w:name="_Toc225441076"/>
-      <w:r>
-        <w:t>Changes to Design</w:t>
-      </w:r>
-      <w:bookmarkEnd w:id="7"/>
-      <w:r>
-        <w:t xml:space="preserve"> </w:t>
-      </w:r>
-    </w:p>
-    <w:p>
-      <w:pPr>
-        <w:pStyle w:val="ListParagraph"/>
-        <w:numPr>
-          <w:ilvl w:val="0"/>
-          <w:numId w:val="6"/>
-        </w:numPr>
-      </w:pPr>
-      <w:r>
-        <w:t xml:space="preserve">Updates to system design. </w:t>
-      </w:r>
-    </w:p>
-    <w:p>
-      <w:pPr>
-        <w:pStyle w:val="ListParagraph"/>
-        <w:numPr>
-          <w:ilvl w:val="0"/>
-          <w:numId w:val="6"/>
-        </w:numPr>
-      </w:pPr>
-      <w:r>
-        <w:t>Read me changes</w:t>
-      </w:r>
-    </w:p>
-    <w:p>
-      <w:pPr>
-        <w:pStyle w:val="Heading1"/>
-        <w:jc w:val="center"/>
-      </w:pPr>
-      <w:bookmarkStart w:id="8" w:name="_Toc225441077"/>
-      <w:r>
-        <w:t>Next Steps</w:t>
-      </w:r>
-      <w:bookmarkEnd w:id="8"/>
-    </w:p>
-    <w:p>
-      <w:pPr>
-        <w:pStyle w:val="Heading2"/>
-      </w:pPr>
-      <w:bookmarkStart w:id="9" w:name="_Toc225441078"/>
-      <w:r>
-        <w:t>Upcoming Features</w:t>
-      </w:r>
-      <w:bookmarkEnd w:id="9"/>
-    </w:p>
-    <w:p>
-      <w:pPr>
-        <w:pStyle w:val="ListParagraph"/>
-        <w:numPr>
-          <w:ilvl w:val="0"/>
-          <w:numId w:val="7"/>
-        </w:numPr>
-      </w:pPr>
-      <w:r>
-        <w:t>Next features being added to the program after current regroup</w:t>
-      </w:r>
-    </w:p>
-    <w:p>
-      <w:pPr>
-        <w:pStyle w:val="ListParagraph"/>
-        <w:numPr>
-          <w:ilvl w:val="0"/>
-          <w:numId w:val="7"/>
-        </w:numPr>
-      </w:pPr>
-      <w:r>
-        <w:t>Features being finalized or added</w:t>
-      </w:r>
-    </w:p>
-    <w:p>
-      <w:pPr>
-        <w:pStyle w:val="ListParagraph"/>
-        <w:numPr>
-          <w:ilvl w:val="0"/>
-          <w:numId w:val="7"/>
-        </w:numPr>
-      </w:pPr>
-      <w:r>
-        <w:t>End date estimations</w:t>
-      </w:r>
-    </w:p>
-    <w:p>
-      <w:pPr>
-        <w:pStyle w:val="Heading2"/>
-      </w:pPr>
-      <w:bookmarkStart w:id="10" w:name="_Toc225441079"/>
-      <w:r>
-        <w:lastRenderedPageBreak/>
-        <w:t>Updates / Fixes</w:t>
-      </w:r>
-      <w:bookmarkEnd w:id="10"/>
-    </w:p>
-    <w:p>
-      <w:pPr>
-        <w:pStyle w:val="ListParagraph"/>
-        <w:numPr>
-          <w:ilvl w:val="0"/>
-          <w:numId w:val="8"/>
-        </w:numPr>
-      </w:pPr>
-      <w:r>
-        <w:t>Like features but for testing</w:t>
-      </w:r>
-    </w:p>
-    <w:p>
-      <w:pPr>
-        <w:pStyle w:val="ListParagraph"/>
-        <w:numPr>
-          <w:ilvl w:val="0"/>
-          <w:numId w:val="8"/>
-        </w:numPr>
-      </w:pPr>
-      <w:r>
-        <w:t>Testing being started for certain sections of the program</w:t>
-      </w:r>
-    </w:p>
-    <w:p>
-      <w:pPr>
-        <w:pStyle w:val="ListParagraph"/>
-        <w:numPr>
-          <w:ilvl w:val="0"/>
-          <w:numId w:val="8"/>
-        </w:numPr>
-      </w:pPr>
-      <w:r>
-        <w:t>End date estimations for the testing</w:t>
-      </w:r>
-    </w:p>
-    <w:p>
-      <w:pPr>
-        <w:pStyle w:val="Heading2"/>
-      </w:pPr>
-      <w:bookmarkStart w:id="11" w:name="_Toc225441080"/>
-      <w:r>
-        <w:t>Development Plan</w:t>
-      </w:r>
-      <w:bookmarkEnd w:id="11"/>
-    </w:p>
-    <w:p>
-      <w:pPr>
-        <w:pStyle w:val="Heading1"/>
-        <w:jc w:val="center"/>
-      </w:pPr>
-      <w:bookmarkStart w:id="12" w:name="_Toc225441081"/>
-      <w:r>
-        <w:t>Issues, Risks, or Challenges</w:t>
-      </w:r>
-      <w:bookmarkEnd w:id="12"/>
-    </w:p>
-    <w:p>
-      <w:pPr>
-        <w:pStyle w:val="Heading2"/>
-      </w:pPr>
-      <w:bookmarkStart w:id="13" w:name="_Toc225441082"/>
-      <w:r>
-        <w:t>Roadblocks</w:t>
-      </w:r>
-      <w:bookmarkEnd w:id="13"/>
+        <w:t>SQL for setting up and querying the server for user logins or creation of the tables</w:t>
+      </w:r>
     </w:p>
     <w:p>
       <w:pPr>
         <w:pStyle w:val="Heading3"/>
       </w:pPr>
-      <w:bookmarkStart w:id="14" w:name="_Toc225441083"/>
-      <w:r>
-        <w:t>Programmatic Delays</w:t>
-      </w:r>
-      <w:bookmarkEnd w:id="14"/>
-    </w:p>
-    <w:p>
-      <w:pPr>
-        <w:pStyle w:val="ListParagraph"/>
-        <w:numPr>
-          <w:ilvl w:val="0"/>
-          <w:numId w:val="9"/>
-        </w:numPr>
-      </w:pPr>
-      <w:r>
-        <w:t>Programmatic delays.</w:t>
-      </w:r>
-    </w:p>
-    <w:p>
-      <w:pPr>
-        <w:pStyle w:val="ListParagraph"/>
-        <w:numPr>
-          <w:ilvl w:val="0"/>
-          <w:numId w:val="9"/>
-        </w:numPr>
-      </w:pPr>
-      <w:r>
-        <w:t>Syntax delays</w:t>
-      </w:r>
-    </w:p>
-    <w:p>
-      <w:pPr>
-        <w:pStyle w:val="ListParagraph"/>
-        <w:numPr>
-          <w:ilvl w:val="0"/>
-          <w:numId w:val="9"/>
-        </w:numPr>
-      </w:pPr>
-      <w:r>
-        <w:t>Runtime errors</w:t>
-      </w:r>
-    </w:p>
-    <w:p>
-      <w:pPr>
-        <w:pStyle w:val="ListParagraph"/>
-        <w:numPr>
-          <w:ilvl w:val="0"/>
-          <w:numId w:val="9"/>
-        </w:numPr>
-      </w:pPr>
-      <w:r>
-        <w:t>Anything to do with programmatic issues or faults</w:t>
-      </w:r>
-    </w:p>
-    <w:p>
-      <w:pPr>
-        <w:pStyle w:val="ListParagraph"/>
-        <w:numPr>
-          <w:ilvl w:val="0"/>
-          <w:numId w:val="9"/>
-        </w:numPr>
-      </w:pPr>
-      <w:r>
-        <w:t>Found in the creation / design sections</w:t>
-      </w:r>
-    </w:p>
-    <w:p>
-      <w:pPr>
-        <w:pStyle w:val="ListParagraph"/>
-        <w:numPr>
-          <w:ilvl w:val="0"/>
-          <w:numId w:val="9"/>
-        </w:numPr>
-      </w:pPr>
-      <w:r>
-        <w:t>Logical flow errors</w:t>
-      </w:r>
-    </w:p>
-    <w:p>
-      <w:pPr>
-        <w:pStyle w:val="ListParagraph"/>
-        <w:numPr>
-          <w:ilvl w:val="0"/>
-          <w:numId w:val="9"/>
-        </w:numPr>
-      </w:pPr>
-      <w:r>
-        <w:t>Internal programmatic errors</w:t>
-      </w:r>
-    </w:p>
-    <w:p>
-      <w:pPr>
-        <w:pStyle w:val="Heading3"/>
-      </w:pPr>
-      <w:bookmarkStart w:id="15" w:name="_Toc225441084"/>
-      <w:r>
-        <w:t>Non-Programmatic Delays</w:t>
-      </w:r>
-      <w:bookmarkEnd w:id="15"/>
-    </w:p>
-    <w:p>
-      <w:pPr>
-        <w:pStyle w:val="ListParagraph"/>
-        <w:numPr>
-          <w:ilvl w:val="0"/>
-          <w:numId w:val="10"/>
-        </w:numPr>
-      </w:pPr>
-      <w:r>
-        <w:t xml:space="preserve">Errors with user experience. </w:t>
-      </w:r>
-    </w:p>
-    <w:p>
-      <w:pPr>
-        <w:pStyle w:val="ListParagraph"/>
-        <w:numPr>
-          <w:ilvl w:val="0"/>
-          <w:numId w:val="10"/>
-        </w:numPr>
-      </w:pPr>
-      <w:r>
-        <w:t>Feel of the system</w:t>
-      </w:r>
-    </w:p>
-    <w:p>
-      <w:pPr>
-        <w:pStyle w:val="ListParagraph"/>
-        <w:numPr>
-          <w:ilvl w:val="0"/>
-          <w:numId w:val="10"/>
-        </w:numPr>
-      </w:pPr>
-      <w:r>
-        <w:t>Nonsystem items that effect the ability of the system ability to function. External environment</w:t>
-      </w:r>
-    </w:p>
-    <w:p>
-      <w:pPr>
-        <w:pStyle w:val="Heading2"/>
-      </w:pPr>
-      <w:bookmarkStart w:id="16" w:name="_Toc225441085"/>
-      <w:r>
-        <w:t>Dependencies</w:t>
-      </w:r>
-      <w:bookmarkEnd w:id="16"/>
-    </w:p>
-    <w:p>
-      <w:pPr>
-        <w:pStyle w:val="ListParagraph"/>
-        <w:numPr>
-          <w:ilvl w:val="0"/>
-          <w:numId w:val="12"/>
-        </w:numPr>
-      </w:pPr>
-      <w:r>
-        <w:t>External libraries needed to run program</w:t>
-      </w:r>
-    </w:p>
-    <w:p>
-      <w:pPr>
-        <w:pStyle w:val="ListParagraph"/>
-        <w:numPr>
-          <w:ilvl w:val="0"/>
-          <w:numId w:val="12"/>
-        </w:numPr>
-      </w:pPr>
-      <w:r>
-        <w:t>Programming languages used</w:t>
-      </w:r>
-    </w:p>
-    <w:p>
-      <w:pPr>
-        <w:pStyle w:val="ListParagraph"/>
-        <w:numPr>
-          <w:ilvl w:val="0"/>
-          <w:numId w:val="12"/>
-        </w:numPr>
-      </w:pPr>
+      <w:bookmarkStart w:id="26" w:name="_Toc226056580"/>
       <w:r>
         <w:t xml:space="preserve">Database server </w:t>
       </w:r>
       <w:r>
         <w:t>and queries</w:t>
       </w:r>
-    </w:p>
-    <w:p>
-      <w:pPr>
-        <w:pStyle w:val="ListParagraph"/>
-        <w:numPr>
-          <w:ilvl w:val="0"/>
-          <w:numId w:val="12"/>
-        </w:numPr>
-      </w:pPr>
-      <w:r>
-        <w:t>Hashing system</w:t>
-      </w:r>
-    </w:p>
-    <w:p>
-      <w:pPr>
-        <w:pStyle w:val="Heading2"/>
-      </w:pPr>
-      <w:bookmarkStart w:id="17" w:name="_Toc225441086"/>
-      <w:r>
-        <w:t>Support Needs</w:t>
-      </w:r>
-      <w:bookmarkEnd w:id="17"/>
-    </w:p>
-    <w:p>
-      <w:pPr>
-        <w:pStyle w:val="ListParagraph"/>
-        <w:numPr>
-          <w:ilvl w:val="0"/>
-          <w:numId w:val="11"/>
-        </w:numPr>
-      </w:pPr>
-      <w:r>
-        <w:t>support needed from the teacher</w:t>
-      </w:r>
+      <w:bookmarkEnd w:id="26"/>
+    </w:p>
+    <w:p>
+      <w:pPr>
+        <w:rPr>
+          <w:lang w:eastAsia="en-US"/>
+        </w:rPr>
+      </w:pPr>
+      <w:r>
+        <w:rPr>
+          <w:lang w:eastAsia="en-US"/>
+        </w:rPr>
+        <w:t xml:space="preserve">The main database server will be called </w:t>
+      </w:r>
+      <w:r>
+        <w:rPr>
+          <w:b/>
+          <w:bCs/>
+          <w:lang w:eastAsia="en-US"/>
+        </w:rPr>
+        <w:t>DB NAME HERE</w:t>
+      </w:r>
+      <w:r>
+        <w:rPr>
+          <w:lang w:eastAsia="en-US"/>
+        </w:rPr>
+        <w:t xml:space="preserve"> and the tables within this server will be small but effective lowering complexity whilst also keeping security.</w:t>
+      </w:r>
+    </w:p>
+    <w:p>
+      <w:pPr>
+        <w:rPr>
+          <w:lang w:eastAsia="en-US"/>
+        </w:rPr>
+      </w:pPr>
+      <w:r>
+        <w:rPr>
+          <w:lang w:eastAsia="en-US"/>
+        </w:rPr>
+        <w:t>The first table will be a user or accounts table in which passwords, emails, usernames, ids are stored alongside the user privilege state.</w:t>
+      </w:r>
+      <w:r>
+        <w:rPr>
+          <w:lang w:eastAsia="en-US"/>
+        </w:rPr>
+        <w:t xml:space="preserve"> The second table will include what games the specific accounts or owns, and the </w:t>
+      </w:r>
+      <w:r>
+        <w:rPr>
+          <w:lang w:eastAsia="en-US"/>
+        </w:rPr>
+        <w:t>third</w:t>
+      </w:r>
+      <w:r>
+        <w:rPr>
+          <w:lang w:eastAsia="en-US"/>
+        </w:rPr>
+        <w:t xml:space="preserve"> table will include a table of all available games within the program. That is used to populate the store.</w:t>
+      </w:r>
+      <w:r>
+        <w:rPr>
+          <w:lang w:eastAsia="en-US"/>
+        </w:rPr>
+        <w:t xml:space="preserve"> The final table is a list of logs that are associated with accounts to determine if multiple login attempts have been made within a short period of time or to determine other security issues for db. users.</w:t>
+      </w:r>
+    </w:p>
+    <w:p>
+      <w:pPr>
+        <w:ind w:left="0"/>
+      </w:pPr>
     </w:p>
     <w:sectPr>
       <w:pgSz w:w="12240" w:h="15840"/>
@@ -4099,6 +5313,119 @@
     </w:lvl>
   </w:abstractNum>
   <w:abstractNum w:abstractNumId="6" w15:restartNumberingAfterBreak="0">
+    <w:nsid w:val="20546388"/>
+    <w:multiLevelType w:val="hybridMultilevel"/>
+    <w:tmpl w:val="4DDEA652"/>
+    <w:lvl w:ilvl="0" w:tplc="10090001">
+      <w:start w:val="1"/>
+      <w:numFmt w:val="bullet"/>
+      <w:lvlText w:val=""/>
+      <w:lvlJc w:val="left"/>
+      <w:pPr>
+        <w:ind w:left="720" w:hanging="360"/>
+      </w:pPr>
+      <w:rPr>
+        <w:rFonts w:ascii="Symbol" w:hAnsi="Symbol" w:hint="default"/>
+      </w:rPr>
+    </w:lvl>
+    <w:lvl w:ilvl="1" w:tplc="10090003" w:tentative="1">
+      <w:start w:val="1"/>
+      <w:numFmt w:val="bullet"/>
+      <w:lvlText w:val="o"/>
+      <w:lvlJc w:val="left"/>
+      <w:pPr>
+        <w:ind w:left="1440" w:hanging="360"/>
+      </w:pPr>
+      <w:rPr>
+        <w:rFonts w:ascii="Courier New" w:hAnsi="Courier New" w:cs="Courier New" w:hint="default"/>
+      </w:rPr>
+    </w:lvl>
+    <w:lvl w:ilvl="2" w:tplc="10090005" w:tentative="1">
+      <w:start w:val="1"/>
+      <w:numFmt w:val="bullet"/>
+      <w:lvlText w:val=""/>
+      <w:lvlJc w:val="left"/>
+      <w:pPr>
+        <w:ind w:left="2160" w:hanging="360"/>
+      </w:pPr>
+      <w:rPr>
+        <w:rFonts w:ascii="Wingdings" w:hAnsi="Wingdings" w:hint="default"/>
+      </w:rPr>
+    </w:lvl>
+    <w:lvl w:ilvl="3" w:tplc="10090001" w:tentative="1">
+      <w:start w:val="1"/>
+      <w:numFmt w:val="bullet"/>
+      <w:lvlText w:val=""/>
+      <w:lvlJc w:val="left"/>
+      <w:pPr>
+        <w:ind w:left="2880" w:hanging="360"/>
+      </w:pPr>
+      <w:rPr>
+        <w:rFonts w:ascii="Symbol" w:hAnsi="Symbol" w:hint="default"/>
+      </w:rPr>
+    </w:lvl>
+    <w:lvl w:ilvl="4" w:tplc="10090003" w:tentative="1">
+      <w:start w:val="1"/>
+      <w:numFmt w:val="bullet"/>
+      <w:lvlText w:val="o"/>
+      <w:lvlJc w:val="left"/>
+      <w:pPr>
+        <w:ind w:left="3600" w:hanging="360"/>
+      </w:pPr>
+      <w:rPr>
+        <w:rFonts w:ascii="Courier New" w:hAnsi="Courier New" w:cs="Courier New" w:hint="default"/>
+      </w:rPr>
+    </w:lvl>
+    <w:lvl w:ilvl="5" w:tplc="10090005" w:tentative="1">
+      <w:start w:val="1"/>
+      <w:numFmt w:val="bullet"/>
+      <w:lvlText w:val=""/>
+      <w:lvlJc w:val="left"/>
+      <w:pPr>
+        <w:ind w:left="4320" w:hanging="360"/>
+      </w:pPr>
+      <w:rPr>
+        <w:rFonts w:ascii="Wingdings" w:hAnsi="Wingdings" w:hint="default"/>
+      </w:rPr>
+    </w:lvl>
+    <w:lvl w:ilvl="6" w:tplc="10090001" w:tentative="1">
+      <w:start w:val="1"/>
+      <w:numFmt w:val="bullet"/>
+      <w:lvlText w:val=""/>
+      <w:lvlJc w:val="left"/>
+      <w:pPr>
+        <w:ind w:left="5040" w:hanging="360"/>
+      </w:pPr>
+      <w:rPr>
+        <w:rFonts w:ascii="Symbol" w:hAnsi="Symbol" w:hint="default"/>
+      </w:rPr>
+    </w:lvl>
+    <w:lvl w:ilvl="7" w:tplc="10090003" w:tentative="1">
+      <w:start w:val="1"/>
+      <w:numFmt w:val="bullet"/>
+      <w:lvlText w:val="o"/>
+      <w:lvlJc w:val="left"/>
+      <w:pPr>
+        <w:ind w:left="5760" w:hanging="360"/>
+      </w:pPr>
+      <w:rPr>
+        <w:rFonts w:ascii="Courier New" w:hAnsi="Courier New" w:cs="Courier New" w:hint="default"/>
+      </w:rPr>
+    </w:lvl>
+    <w:lvl w:ilvl="8" w:tplc="10090005" w:tentative="1">
+      <w:start w:val="1"/>
+      <w:numFmt w:val="bullet"/>
+      <w:lvlText w:val=""/>
+      <w:lvlJc w:val="left"/>
+      <w:pPr>
+        <w:ind w:left="6480" w:hanging="360"/>
+      </w:pPr>
+      <w:rPr>
+        <w:rFonts w:ascii="Wingdings" w:hAnsi="Wingdings" w:hint="default"/>
+      </w:rPr>
+    </w:lvl>
+  </w:abstractNum>
+  <w:abstractNum w:abstractNumId="7" w15:restartNumberingAfterBreak="0">
     <w:nsid w:val="313753C4"/>
     <w:multiLevelType w:val="hybridMultilevel"/>
     <w:tmpl w:val="8C16B4BC"/>
@@ -4211,7 +5538,7 @@
       </w:rPr>
     </w:lvl>
   </w:abstractNum>
-  <w:abstractNum w:abstractNumId="7" w15:restartNumberingAfterBreak="0">
+  <w:abstractNum w:abstractNumId="8" w15:restartNumberingAfterBreak="0">
     <w:nsid w:val="34B712C0"/>
     <w:multiLevelType w:val="hybridMultilevel"/>
     <w:tmpl w:val="08FCFBA6"/>
@@ -4324,7 +5651,7 @@
       </w:rPr>
     </w:lvl>
   </w:abstractNum>
-  <w:abstractNum w:abstractNumId="8" w15:restartNumberingAfterBreak="0">
+  <w:abstractNum w:abstractNumId="9" w15:restartNumberingAfterBreak="0">
     <w:nsid w:val="36BA2FE3"/>
     <w:multiLevelType w:val="hybridMultilevel"/>
     <w:tmpl w:val="915ABCD2"/>
@@ -4437,7 +5764,7 @@
       </w:rPr>
     </w:lvl>
   </w:abstractNum>
-  <w:abstractNum w:abstractNumId="9" w15:restartNumberingAfterBreak="0">
+  <w:abstractNum w:abstractNumId="10" w15:restartNumberingAfterBreak="0">
     <w:nsid w:val="46D51D5E"/>
     <w:multiLevelType w:val="hybridMultilevel"/>
     <w:tmpl w:val="A3488424"/>
@@ -4523,7 +5850,7 @@
       </w:pPr>
     </w:lvl>
   </w:abstractNum>
-  <w:abstractNum w:abstractNumId="10" w15:restartNumberingAfterBreak="0">
+  <w:abstractNum w:abstractNumId="11" w15:restartNumberingAfterBreak="0">
     <w:nsid w:val="600D0A9B"/>
     <w:multiLevelType w:val="hybridMultilevel"/>
     <w:tmpl w:val="F5CAF0C6"/>
@@ -4636,7 +5963,7 @@
       </w:rPr>
     </w:lvl>
   </w:abstractNum>
-  <w:abstractNum w:abstractNumId="11" w15:restartNumberingAfterBreak="0">
+  <w:abstractNum w:abstractNumId="12" w15:restartNumberingAfterBreak="0">
     <w:nsid w:val="63017B7A"/>
     <w:multiLevelType w:val="hybridMultilevel"/>
     <w:tmpl w:val="70AE5A82"/>
@@ -4749,7 +6076,7 @@
       </w:rPr>
     </w:lvl>
   </w:abstractNum>
-  <w:abstractNum w:abstractNumId="12" w15:restartNumberingAfterBreak="0">
+  <w:abstractNum w:abstractNumId="13" w15:restartNumberingAfterBreak="0">
     <w:nsid w:val="730D0924"/>
     <w:multiLevelType w:val="hybridMultilevel"/>
     <w:tmpl w:val="C7187416"/>
@@ -4863,28 +6190,28 @@
     </w:lvl>
   </w:abstractNum>
   <w:num w:numId="1" w16cid:durableId="335887225">
-    <w:abstractNumId w:val="9"/>
+    <w:abstractNumId w:val="10"/>
   </w:num>
   <w:num w:numId="2" w16cid:durableId="1806311288">
     <w:abstractNumId w:val="2"/>
   </w:num>
   <w:num w:numId="3" w16cid:durableId="879127564">
-    <w:abstractNumId w:val="10"/>
+    <w:abstractNumId w:val="11"/>
   </w:num>
   <w:num w:numId="4" w16cid:durableId="257838733">
-    <w:abstractNumId w:val="8"/>
+    <w:abstractNumId w:val="9"/>
   </w:num>
   <w:num w:numId="5" w16cid:durableId="1354650651">
-    <w:abstractNumId w:val="11"/>
+    <w:abstractNumId w:val="12"/>
   </w:num>
   <w:num w:numId="6" w16cid:durableId="1111365763">
     <w:abstractNumId w:val="3"/>
   </w:num>
   <w:num w:numId="7" w16cid:durableId="1740054252">
-    <w:abstractNumId w:val="12"/>
+    <w:abstractNumId w:val="13"/>
   </w:num>
   <w:num w:numId="8" w16cid:durableId="282463570">
-    <w:abstractNumId w:val="7"/>
+    <w:abstractNumId w:val="8"/>
   </w:num>
   <w:num w:numId="9" w16cid:durableId="1310358449">
     <w:abstractNumId w:val="5"/>
@@ -4896,10 +6223,13 @@
     <w:abstractNumId w:val="4"/>
   </w:num>
   <w:num w:numId="12" w16cid:durableId="924919724">
-    <w:abstractNumId w:val="6"/>
+    <w:abstractNumId w:val="7"/>
   </w:num>
   <w:num w:numId="13" w16cid:durableId="1863669041">
     <w:abstractNumId w:val="1"/>
+  </w:num>
+  <w:num w:numId="14" w16cid:durableId="1877738286">
+    <w:abstractNumId w:val="6"/>
   </w:num>
 </w:numbering>
 </file>

</xml_diff>

<commit_message>
Update Lab_05.docx and final project PDF
Replace Lab_05.docx and report_finalProject.pdf with updated versions containing edits and final revisions to the lab and final project report.
</commit_message>
<xml_diff>
--- a/Lab_05.docx
+++ b/Lab_05.docx
@@ -3213,30 +3213,8 @@
           <w:lang w:eastAsia="en-US"/>
         </w:rPr>
         <w:tab/>
-        <w:t xml:space="preserve">EX: </w:t>
-      </w:r>
-      <w:proofErr w:type="gramStart"/>
-      <w:r>
-        <w:rPr>
-          <w:lang w:eastAsia="en-US"/>
-        </w:rPr>
-        <w:t>as:A</w:t>
-      </w:r>
-      <w:proofErr w:type="gramEnd"/>
-      <w:r>
-        <w:rPr>
-          <w:lang w:eastAsia="en-US"/>
-        </w:rPr>
-        <w:t>&gt;#R</w:t>
-      </w:r>
-      <w:proofErr w:type="gramStart"/>
-      <w:r>
-        <w:rPr>
-          <w:lang w:eastAsia="en-US"/>
-        </w:rPr>
-        <w:t>”:Aasdk</w:t>
-      </w:r>
-      <w:proofErr w:type="gramEnd"/>
+        <w:t>EX: as:A&gt;#R”:Aasdk</w:t>
+      </w:r>
     </w:p>
     <w:p>
       <w:pPr>
@@ -3364,15 +3342,7 @@
         <w:t>:</w:t>
       </w:r>
       <w:r>
-        <w:t xml:space="preserve"> will protect users accounts by sending a code to </w:t>
-      </w:r>
-      <w:proofErr w:type="gramStart"/>
-      <w:r>
-        <w:t>a</w:t>
-      </w:r>
-      <w:proofErr w:type="gramEnd"/>
-      <w:r>
-        <w:t xml:space="preserve"> email or phone after a successful login to stop hackers who have found out the password from entering the account. </w:t>
+        <w:t xml:space="preserve"> will protect users accounts by sending a code to a email or phone after a successful login to stop hackers who have found out the password from entering the account. </w:t>
       </w:r>
     </w:p>
     <w:p>
@@ -3425,15 +3395,7 @@
         <w:t xml:space="preserve">Using regex and validation checks </w:t>
       </w:r>
       <w:r>
-        <w:t xml:space="preserve">to remove white space and illegal characters such </w:t>
-      </w:r>
-      <w:proofErr w:type="gramStart"/>
-      <w:r>
-        <w:t>as ;</w:t>
-      </w:r>
-      <w:proofErr w:type="gramEnd"/>
-      <w:r>
-        <w:t xml:space="preserve"> or &lt;&gt;. This way no query syntax characters enter the database.</w:t>
+        <w:t>to remove white space and illegal characters such as ; or &lt;&gt;. This way no query syntax characters enter the database.</w:t>
       </w:r>
     </w:p>
     <w:p>
@@ -3811,21 +3773,7 @@
         <w:rPr>
           <w:lang w:eastAsia="en-US"/>
         </w:rPr>
-        <w:t xml:space="preserve"> This will also bring up the use of further procedures or tables within the SQL database should they be needed making </w:t>
-      </w:r>
-      <w:proofErr w:type="gramStart"/>
-      <w:r>
-        <w:rPr>
-          <w:lang w:eastAsia="en-US"/>
-        </w:rPr>
-        <w:t>it</w:t>
-      </w:r>
-      <w:proofErr w:type="gramEnd"/>
-      <w:r>
-        <w:rPr>
-          <w:lang w:eastAsia="en-US"/>
-        </w:rPr>
-        <w:t xml:space="preserve"> so we don’t have to return to the SQL multiple times to see if certain tables are needed to be updated or not.</w:t>
+        <w:t xml:space="preserve"> This will also bring up the use of further procedures or tables within the SQL database should they be needed making it so we don’t have to return to the SQL multiple times to see if certain tables are needed to be updated or not.</w:t>
       </w:r>
     </w:p>
     <w:p>
@@ -4373,21 +4321,7 @@
           <w:lang w:eastAsia="en-US"/>
         </w:rPr>
         <w:tab/>
-        <w:t xml:space="preserve">Relearning how to create rest Api’s once again after being away from them for so long lead to some growing pains as we reimbursed ourselves in connecting </w:t>
-      </w:r>
-      <w:proofErr w:type="gramStart"/>
-      <w:r>
-        <w:rPr>
-          <w:lang w:eastAsia="en-US"/>
-        </w:rPr>
-        <w:t>a</w:t>
-      </w:r>
-      <w:proofErr w:type="gramEnd"/>
-      <w:r>
-        <w:rPr>
-          <w:lang w:eastAsia="en-US"/>
-        </w:rPr>
-        <w:t xml:space="preserve"> Api to an SQL server. The syntax for [HTTP] requests specifically gave us a small challenge as they aren’t as easily picked up on compared to the rest of the c# coding language. </w:t>
+        <w:t xml:space="preserve">Relearning how to create rest Api’s once again after being away from them for so long lead to some growing pains as we reimbursed ourselves in connecting a Api to an SQL server. The syntax for [HTTP] requests specifically gave us a small challenge as they aren’t as easily picked up on compared to the rest of the c# coding language. </w:t>
       </w:r>
     </w:p>
     <w:p>
@@ -4594,11 +4528,9 @@
       </w:r>
       <w:r>
         <w:rPr>
-          <w:b/>
-          <w:bCs/>
-          <w:lang w:eastAsia="en-US"/>
-        </w:rPr>
-        <w:t>DB NAME HERE</w:t>
+          <w:lang w:eastAsia="en-US"/>
+        </w:rPr>
+        <w:t>Mist</w:t>
       </w:r>
       <w:r>
         <w:rPr>
@@ -4606,13 +4538,12 @@
         </w:rPr>
         <w:t xml:space="preserve"> and the tables within this server will be small but effective lowering complexity whilst also keeping security.</w:t>
       </w:r>
-    </w:p>
-    <w:p>
-      <w:pPr>
-        <w:rPr>
-          <w:lang w:eastAsia="en-US"/>
-        </w:rPr>
-      </w:pPr>
+      <w:r>
+        <w:rPr>
+          <w:lang w:eastAsia="en-US"/>
+        </w:rPr>
+        <w:t xml:space="preserve"> </w:t>
+      </w:r>
       <w:r>
         <w:rPr>
           <w:lang w:eastAsia="en-US"/>

</xml_diff>